<commit_message>
Resume (Word): drop desired-role/salary row and sections below certificates
Co-Authored-By: Claude Opus 5.5 <noreply@anthropic.com>
Claude-Session: https://claude.ai/code/session_01NeCKgJUUKVxaAf9NpMrAyB
</commit_message>
<xml_diff>
--- a/resume/이력서.docx
+++ b/resume/이력서.docx
@@ -543,137 +543,6 @@
           </w:p>
         </w:tc>
       </w:tr>
-      <w:tr>
-        <w:trPr>
-          <w:trHeight w:val="440" w:hRule="atLeast"/>
-        </w:trPr>
-        <w:tc>
-          <w:tcPr>
-            <w:vMerge w:val="continue"/>
-            <w:tcBorders>
-              <w:top w:val="single" w:color="1B1F24" w:sz="12"/>
-              <w:left w:val="single" w:color="9AA3AD" w:sz="4"/>
-              <w:bottom w:val="single" w:color="9AA3AD" w:sz="4"/>
-              <w:right w:val="single" w:color="9AA3AD" w:sz="4"/>
-            </w:tcBorders>
-          </w:tcPr>
-          <w:p/>
-        </w:tc>
-        <w:tc>
-          <w:tcPr>
-            <w:tcW w:type="dxa" w:w="1350"/>
-            <w:tcBorders>
-              <w:top w:val="single" w:color="9AA3AD" w:sz="4"/>
-              <w:left w:val="single" w:color="9AA3AD" w:sz="4"/>
-              <w:bottom w:val="single" w:color="9AA3AD" w:sz="4"/>
-              <w:right w:val="single" w:color="9AA3AD" w:sz="4"/>
-            </w:tcBorders>
-            <w:shd w:fill="EEF1F5" w:color="auto" w:val="clear"/>
-            <w:tcMar>
-              <w:top w:type="dxa" w:w="60"/>
-              <w:left w:type="dxa" w:w="100"/>
-              <w:bottom w:type="dxa" w:w="60"/>
-              <w:right w:type="dxa" w:w="100"/>
-            </w:tcMar>
-            <w:vAlign w:val="center"/>
-          </w:tcPr>
-          <w:p>
-            <w:pPr>
-              <w:spacing w:after="0" w:before="0"/>
-              <w:jc w:val="center"/>
-            </w:pPr>
-            <w:r>
-              <w:rPr>
-                <w:rFonts w:ascii="맑은 고딕" w:cs="맑은 고딕" w:eastAsia="맑은 고딕" w:hAnsi="맑은 고딕"/>
-                <w:sz w:val="19"/>
-                <w:szCs w:val="19"/>
-              </w:rPr>
-              <w:t xml:space="preserve">지원분야</w:t>
-            </w:r>
-          </w:p>
-        </w:tc>
-        <w:tc>
-          <w:tcPr>
-            <w:tcW w:type="dxa" w:w="2728"/>
-            <w:tcBorders>
-              <w:top w:val="single" w:color="9AA3AD" w:sz="4"/>
-              <w:left w:val="single" w:color="9AA3AD" w:sz="4"/>
-              <w:bottom w:val="single" w:color="9AA3AD" w:sz="4"/>
-              <w:right w:val="single" w:color="9AA3AD" w:sz="4"/>
-            </w:tcBorders>
-            <w:tcMar>
-              <w:top w:type="dxa" w:w="60"/>
-              <w:left w:type="dxa" w:w="100"/>
-              <w:bottom w:type="dxa" w:w="60"/>
-              <w:right w:type="dxa" w:w="100"/>
-            </w:tcMar>
-            <w:vAlign w:val="center"/>
-          </w:tcPr>
-          <w:p>
-            <w:pPr>
-              <w:spacing w:after="0" w:before="0"/>
-              <w:jc w:val="left"/>
-            </w:pPr>
-          </w:p>
-        </w:tc>
-        <w:tc>
-          <w:tcPr>
-            <w:tcW w:type="dxa" w:w="1350"/>
-            <w:tcBorders>
-              <w:top w:val="single" w:color="9AA3AD" w:sz="4"/>
-              <w:left w:val="single" w:color="9AA3AD" w:sz="4"/>
-              <w:bottom w:val="single" w:color="9AA3AD" w:sz="4"/>
-              <w:right w:val="single" w:color="9AA3AD" w:sz="4"/>
-            </w:tcBorders>
-            <w:shd w:fill="EEF1F5" w:color="auto" w:val="clear"/>
-            <w:tcMar>
-              <w:top w:type="dxa" w:w="60"/>
-              <w:left w:type="dxa" w:w="100"/>
-              <w:bottom w:type="dxa" w:w="60"/>
-              <w:right w:type="dxa" w:w="100"/>
-            </w:tcMar>
-            <w:vAlign w:val="center"/>
-          </w:tcPr>
-          <w:p>
-            <w:pPr>
-              <w:spacing w:after="0" w:before="0"/>
-              <w:jc w:val="center"/>
-            </w:pPr>
-            <w:r>
-              <w:rPr>
-                <w:rFonts w:ascii="맑은 고딕" w:cs="맑은 고딕" w:eastAsia="맑은 고딕" w:hAnsi="맑은 고딕"/>
-                <w:sz w:val="19"/>
-                <w:szCs w:val="19"/>
-              </w:rPr>
-              <w:t xml:space="preserve">희망연봉</w:t>
-            </w:r>
-          </w:p>
-        </w:tc>
-        <w:tc>
-          <w:tcPr>
-            <w:tcW w:type="dxa" w:w="2778"/>
-            <w:tcBorders>
-              <w:top w:val="single" w:color="9AA3AD" w:sz="4"/>
-              <w:left w:val="single" w:color="9AA3AD" w:sz="4"/>
-              <w:bottom w:val="single" w:color="9AA3AD" w:sz="4"/>
-              <w:right w:val="single" w:color="9AA3AD" w:sz="4"/>
-            </w:tcBorders>
-            <w:tcMar>
-              <w:top w:type="dxa" w:w="60"/>
-              <w:left w:type="dxa" w:w="100"/>
-              <w:bottom w:type="dxa" w:w="60"/>
-              <w:right w:type="dxa" w:w="100"/>
-            </w:tcMar>
-            <w:vAlign w:val="center"/>
-          </w:tcPr>
-          <w:p>
-            <w:pPr>
-              <w:spacing w:after="0" w:before="0"/>
-              <w:jc w:val="left"/>
-            </w:pPr>
-          </w:p>
-        </w:tc>
-      </w:tr>
     </w:tbl>
     <w:p>
       <w:pPr>
@@ -2006,931 +1875,6 @@
         </w:tc>
       </w:tr>
     </w:tbl>
-    <w:p>
-      <w:pPr>
-        <w:keepNext/>
-        <w:pBdr>
-          <w:left w:val="single" w:color="1F3A5F" w:sz="24" w:space="6"/>
-        </w:pBdr>
-        <w:spacing w:after="100" w:before="280"/>
-      </w:pPr>
-      <w:r>
-        <w:rPr>
-          <w:rFonts w:ascii="맑은 고딕" w:cs="맑은 고딕" w:eastAsia="맑은 고딕" w:hAnsi="맑은 고딕"/>
-          <w:b/>
-          <w:bCs/>
-          <w:color w:val="1F3A5F"/>
-          <w:sz w:val="22"/>
-          <w:szCs w:val="22"/>
-        </w:rPr>
-        <w:t xml:space="preserve">교육 · 연수 / 대외활동</w:t>
-      </w:r>
-    </w:p>
-    <w:tbl>
-      <w:tblPr>
-        <w:tblW w:type="dxa" w:w="9906"/>
-        <w:tblBorders>
-          <w:top w:val="single" w:color="auto" w:sz="4"/>
-          <w:left w:val="single" w:color="auto" w:sz="4"/>
-          <w:bottom w:val="single" w:color="auto" w:sz="4"/>
-          <w:right w:val="single" w:color="auto" w:sz="4"/>
-          <w:insideH w:val="single" w:color="auto" w:sz="4"/>
-          <w:insideV w:val="single" w:color="auto" w:sz="4"/>
-        </w:tblBorders>
-      </w:tblPr>
-      <w:tblGrid>
-        <w:gridCol w:w="2377"/>
-        <w:gridCol w:w="4557"/>
-        <w:gridCol w:w="2972"/>
-      </w:tblGrid>
-      <w:tr>
-        <w:trPr>
-          <w:trHeight w:val="420" w:hRule="atLeast"/>
-        </w:trPr>
-        <w:tc>
-          <w:tcPr>
-            <w:tcW w:type="dxa" w:w="2377"/>
-            <w:tcBorders>
-              <w:top w:val="single" w:color="1B1F24" w:sz="12"/>
-              <w:left w:val="single" w:color="9AA3AD" w:sz="4"/>
-              <w:bottom w:val="single" w:color="9AA3AD" w:sz="4"/>
-              <w:right w:val="single" w:color="9AA3AD" w:sz="4"/>
-            </w:tcBorders>
-            <w:shd w:fill="EEF1F5" w:color="auto" w:val="clear"/>
-            <w:tcMar>
-              <w:top w:type="dxa" w:w="60"/>
-              <w:left w:type="dxa" w:w="100"/>
-              <w:bottom w:type="dxa" w:w="60"/>
-              <w:right w:type="dxa" w:w="100"/>
-            </w:tcMar>
-            <w:vAlign w:val="center"/>
-          </w:tcPr>
-          <w:p>
-            <w:pPr>
-              <w:spacing w:after="0" w:before="0"/>
-              <w:jc w:val="center"/>
-            </w:pPr>
-            <w:r>
-              <w:rPr>
-                <w:rFonts w:ascii="맑은 고딕" w:cs="맑은 고딕" w:eastAsia="맑은 고딕" w:hAnsi="맑은 고딕"/>
-                <w:sz w:val="19"/>
-                <w:szCs w:val="19"/>
-              </w:rPr>
-              <w:t xml:space="preserve">기간</w:t>
-            </w:r>
-          </w:p>
-        </w:tc>
-        <w:tc>
-          <w:tcPr>
-            <w:tcW w:type="dxa" w:w="4557"/>
-            <w:tcBorders>
-              <w:top w:val="single" w:color="1B1F24" w:sz="12"/>
-              <w:left w:val="single" w:color="9AA3AD" w:sz="4"/>
-              <w:bottom w:val="single" w:color="9AA3AD" w:sz="4"/>
-              <w:right w:val="single" w:color="9AA3AD" w:sz="4"/>
-            </w:tcBorders>
-            <w:shd w:fill="EEF1F5" w:color="auto" w:val="clear"/>
-            <w:tcMar>
-              <w:top w:type="dxa" w:w="60"/>
-              <w:left w:type="dxa" w:w="100"/>
-              <w:bottom w:type="dxa" w:w="60"/>
-              <w:right w:type="dxa" w:w="100"/>
-            </w:tcMar>
-            <w:vAlign w:val="center"/>
-          </w:tcPr>
-          <w:p>
-            <w:pPr>
-              <w:spacing w:after="0" w:before="0"/>
-              <w:jc w:val="center"/>
-            </w:pPr>
-            <w:r>
-              <w:rPr>
-                <w:rFonts w:ascii="맑은 고딕" w:cs="맑은 고딕" w:eastAsia="맑은 고딕" w:hAnsi="맑은 고딕"/>
-                <w:sz w:val="19"/>
-                <w:szCs w:val="19"/>
-              </w:rPr>
-              <w:t xml:space="preserve">내용</w:t>
-            </w:r>
-          </w:p>
-        </w:tc>
-        <w:tc>
-          <w:tcPr>
-            <w:tcW w:type="dxa" w:w="2972"/>
-            <w:tcBorders>
-              <w:top w:val="single" w:color="1B1F24" w:sz="12"/>
-              <w:left w:val="single" w:color="9AA3AD" w:sz="4"/>
-              <w:bottom w:val="single" w:color="9AA3AD" w:sz="4"/>
-              <w:right w:val="single" w:color="9AA3AD" w:sz="4"/>
-            </w:tcBorders>
-            <w:shd w:fill="EEF1F5" w:color="auto" w:val="clear"/>
-            <w:tcMar>
-              <w:top w:type="dxa" w:w="60"/>
-              <w:left w:type="dxa" w:w="100"/>
-              <w:bottom w:type="dxa" w:w="60"/>
-              <w:right w:type="dxa" w:w="100"/>
-            </w:tcMar>
-            <w:vAlign w:val="center"/>
-          </w:tcPr>
-          <w:p>
-            <w:pPr>
-              <w:spacing w:after="0" w:before="0"/>
-              <w:jc w:val="center"/>
-            </w:pPr>
-            <w:r>
-              <w:rPr>
-                <w:rFonts w:ascii="맑은 고딕" w:cs="맑은 고딕" w:eastAsia="맑은 고딕" w:hAnsi="맑은 고딕"/>
-                <w:sz w:val="19"/>
-                <w:szCs w:val="19"/>
-              </w:rPr>
-              <w:t xml:space="preserve">기관</w:t>
-            </w:r>
-          </w:p>
-        </w:tc>
-      </w:tr>
-      <w:tr>
-        <w:trPr>
-          <w:trHeight w:val="420" w:hRule="atLeast"/>
-        </w:trPr>
-        <w:tc>
-          <w:tcPr>
-            <w:tcW w:type="dxa" w:w="2377"/>
-            <w:tcBorders>
-              <w:top w:val="single" w:color="9AA3AD" w:sz="4"/>
-              <w:left w:val="single" w:color="9AA3AD" w:sz="4"/>
-              <w:bottom w:val="single" w:color="9AA3AD" w:sz="4"/>
-              <w:right w:val="single" w:color="9AA3AD" w:sz="4"/>
-            </w:tcBorders>
-            <w:tcMar>
-              <w:top w:type="dxa" w:w="60"/>
-              <w:left w:type="dxa" w:w="100"/>
-              <w:bottom w:type="dxa" w:w="60"/>
-              <w:right w:type="dxa" w:w="100"/>
-            </w:tcMar>
-            <w:vAlign w:val="center"/>
-          </w:tcPr>
-          <w:p>
-            <w:pPr>
-              <w:spacing w:after="0" w:before="0"/>
-              <w:jc w:val="left"/>
-            </w:pPr>
-          </w:p>
-        </w:tc>
-        <w:tc>
-          <w:tcPr>
-            <w:tcW w:type="dxa" w:w="4557"/>
-            <w:tcBorders>
-              <w:top w:val="single" w:color="9AA3AD" w:sz="4"/>
-              <w:left w:val="single" w:color="9AA3AD" w:sz="4"/>
-              <w:bottom w:val="single" w:color="9AA3AD" w:sz="4"/>
-              <w:right w:val="single" w:color="9AA3AD" w:sz="4"/>
-            </w:tcBorders>
-            <w:tcMar>
-              <w:top w:type="dxa" w:w="60"/>
-              <w:left w:type="dxa" w:w="100"/>
-              <w:bottom w:type="dxa" w:w="60"/>
-              <w:right w:type="dxa" w:w="100"/>
-            </w:tcMar>
-            <w:vAlign w:val="center"/>
-          </w:tcPr>
-          <w:p>
-            <w:pPr>
-              <w:spacing w:after="0" w:before="0"/>
-              <w:jc w:val="left"/>
-            </w:pPr>
-          </w:p>
-        </w:tc>
-        <w:tc>
-          <w:tcPr>
-            <w:tcW w:type="dxa" w:w="2972"/>
-            <w:tcBorders>
-              <w:top w:val="single" w:color="9AA3AD" w:sz="4"/>
-              <w:left w:val="single" w:color="9AA3AD" w:sz="4"/>
-              <w:bottom w:val="single" w:color="9AA3AD" w:sz="4"/>
-              <w:right w:val="single" w:color="9AA3AD" w:sz="4"/>
-            </w:tcBorders>
-            <w:tcMar>
-              <w:top w:type="dxa" w:w="60"/>
-              <w:left w:type="dxa" w:w="100"/>
-              <w:bottom w:type="dxa" w:w="60"/>
-              <w:right w:type="dxa" w:w="100"/>
-            </w:tcMar>
-            <w:vAlign w:val="center"/>
-          </w:tcPr>
-          <w:p>
-            <w:pPr>
-              <w:spacing w:after="0" w:before="0"/>
-              <w:jc w:val="left"/>
-            </w:pPr>
-          </w:p>
-        </w:tc>
-      </w:tr>
-      <w:tr>
-        <w:trPr>
-          <w:trHeight w:val="420" w:hRule="atLeast"/>
-        </w:trPr>
-        <w:tc>
-          <w:tcPr>
-            <w:tcW w:type="dxa" w:w="2377"/>
-            <w:tcBorders>
-              <w:top w:val="single" w:color="9AA3AD" w:sz="4"/>
-              <w:left w:val="single" w:color="9AA3AD" w:sz="4"/>
-              <w:bottom w:val="single" w:color="9AA3AD" w:sz="4"/>
-              <w:right w:val="single" w:color="9AA3AD" w:sz="4"/>
-            </w:tcBorders>
-            <w:tcMar>
-              <w:top w:type="dxa" w:w="60"/>
-              <w:left w:type="dxa" w:w="100"/>
-              <w:bottom w:type="dxa" w:w="60"/>
-              <w:right w:type="dxa" w:w="100"/>
-            </w:tcMar>
-            <w:vAlign w:val="center"/>
-          </w:tcPr>
-          <w:p>
-            <w:pPr>
-              <w:spacing w:after="0" w:before="0"/>
-              <w:jc w:val="left"/>
-            </w:pPr>
-          </w:p>
-        </w:tc>
-        <w:tc>
-          <w:tcPr>
-            <w:tcW w:type="dxa" w:w="4557"/>
-            <w:tcBorders>
-              <w:top w:val="single" w:color="9AA3AD" w:sz="4"/>
-              <w:left w:val="single" w:color="9AA3AD" w:sz="4"/>
-              <w:bottom w:val="single" w:color="9AA3AD" w:sz="4"/>
-              <w:right w:val="single" w:color="9AA3AD" w:sz="4"/>
-            </w:tcBorders>
-            <w:tcMar>
-              <w:top w:type="dxa" w:w="60"/>
-              <w:left w:type="dxa" w:w="100"/>
-              <w:bottom w:type="dxa" w:w="60"/>
-              <w:right w:type="dxa" w:w="100"/>
-            </w:tcMar>
-            <w:vAlign w:val="center"/>
-          </w:tcPr>
-          <w:p>
-            <w:pPr>
-              <w:spacing w:after="0" w:before="0"/>
-              <w:jc w:val="left"/>
-            </w:pPr>
-          </w:p>
-        </w:tc>
-        <w:tc>
-          <w:tcPr>
-            <w:tcW w:type="dxa" w:w="2972"/>
-            <w:tcBorders>
-              <w:top w:val="single" w:color="9AA3AD" w:sz="4"/>
-              <w:left w:val="single" w:color="9AA3AD" w:sz="4"/>
-              <w:bottom w:val="single" w:color="9AA3AD" w:sz="4"/>
-              <w:right w:val="single" w:color="9AA3AD" w:sz="4"/>
-            </w:tcBorders>
-            <w:tcMar>
-              <w:top w:type="dxa" w:w="60"/>
-              <w:left w:type="dxa" w:w="100"/>
-              <w:bottom w:type="dxa" w:w="60"/>
-              <w:right w:type="dxa" w:w="100"/>
-            </w:tcMar>
-            <w:vAlign w:val="center"/>
-          </w:tcPr>
-          <w:p>
-            <w:pPr>
-              <w:spacing w:after="0" w:before="0"/>
-              <w:jc w:val="left"/>
-            </w:pPr>
-          </w:p>
-        </w:tc>
-      </w:tr>
-    </w:tbl>
-    <w:p>
-      <w:pPr>
-        <w:keepNext/>
-        <w:pBdr>
-          <w:left w:val="single" w:color="1F3A5F" w:sz="24" w:space="6"/>
-        </w:pBdr>
-        <w:spacing w:after="100" w:before="280"/>
-      </w:pPr>
-      <w:r>
-        <w:rPr>
-          <w:rFonts w:ascii="맑은 고딕" w:cs="맑은 고딕" w:eastAsia="맑은 고딕" w:hAnsi="맑은 고딕"/>
-          <w:b/>
-          <w:bCs/>
-          <w:color w:val="1F3A5F"/>
-          <w:sz w:val="22"/>
-          <w:szCs w:val="22"/>
-        </w:rPr>
-        <w:t xml:space="preserve">어학 · 컴퓨터 활용</w:t>
-      </w:r>
-    </w:p>
-    <w:tbl>
-      <w:tblPr>
-        <w:tblW w:type="dxa" w:w="9906"/>
-        <w:tblBorders>
-          <w:top w:val="single" w:color="auto" w:sz="4"/>
-          <w:left w:val="single" w:color="auto" w:sz="4"/>
-          <w:bottom w:val="single" w:color="auto" w:sz="4"/>
-          <w:right w:val="single" w:color="auto" w:sz="4"/>
-          <w:insideH w:val="single" w:color="auto" w:sz="4"/>
-          <w:insideV w:val="single" w:color="auto" w:sz="4"/>
-        </w:tblBorders>
-      </w:tblPr>
-      <w:tblGrid>
-        <w:gridCol w:w="2377"/>
-        <w:gridCol w:w="4557"/>
-        <w:gridCol w:w="2972"/>
-      </w:tblGrid>
-      <w:tr>
-        <w:trPr>
-          <w:trHeight w:val="420" w:hRule="atLeast"/>
-        </w:trPr>
-        <w:tc>
-          <w:tcPr>
-            <w:tcW w:type="dxa" w:w="2377"/>
-            <w:tcBorders>
-              <w:top w:val="single" w:color="1B1F24" w:sz="12"/>
-              <w:left w:val="single" w:color="9AA3AD" w:sz="4"/>
-              <w:bottom w:val="single" w:color="9AA3AD" w:sz="4"/>
-              <w:right w:val="single" w:color="9AA3AD" w:sz="4"/>
-            </w:tcBorders>
-            <w:shd w:fill="EEF1F5" w:color="auto" w:val="clear"/>
-            <w:tcMar>
-              <w:top w:type="dxa" w:w="60"/>
-              <w:left w:type="dxa" w:w="100"/>
-              <w:bottom w:type="dxa" w:w="60"/>
-              <w:right w:type="dxa" w:w="100"/>
-            </w:tcMar>
-            <w:vAlign w:val="center"/>
-          </w:tcPr>
-          <w:p>
-            <w:pPr>
-              <w:spacing w:after="0" w:before="0"/>
-              <w:jc w:val="center"/>
-            </w:pPr>
-            <w:r>
-              <w:rPr>
-                <w:rFonts w:ascii="맑은 고딕" w:cs="맑은 고딕" w:eastAsia="맑은 고딕" w:hAnsi="맑은 고딕"/>
-                <w:sz w:val="19"/>
-                <w:szCs w:val="19"/>
-              </w:rPr>
-              <w:t xml:space="preserve">구분</w:t>
-            </w:r>
-          </w:p>
-        </w:tc>
-        <w:tc>
-          <w:tcPr>
-            <w:tcW w:type="dxa" w:w="4557"/>
-            <w:tcBorders>
-              <w:top w:val="single" w:color="1B1F24" w:sz="12"/>
-              <w:left w:val="single" w:color="9AA3AD" w:sz="4"/>
-              <w:bottom w:val="single" w:color="9AA3AD" w:sz="4"/>
-              <w:right w:val="single" w:color="9AA3AD" w:sz="4"/>
-            </w:tcBorders>
-            <w:shd w:fill="EEF1F5" w:color="auto" w:val="clear"/>
-            <w:tcMar>
-              <w:top w:type="dxa" w:w="60"/>
-              <w:left w:type="dxa" w:w="100"/>
-              <w:bottom w:type="dxa" w:w="60"/>
-              <w:right w:type="dxa" w:w="100"/>
-            </w:tcMar>
-            <w:vAlign w:val="center"/>
-          </w:tcPr>
-          <w:p>
-            <w:pPr>
-              <w:spacing w:after="0" w:before="0"/>
-              <w:jc w:val="center"/>
-            </w:pPr>
-            <w:r>
-              <w:rPr>
-                <w:rFonts w:ascii="맑은 고딕" w:cs="맑은 고딕" w:eastAsia="맑은 고딕" w:hAnsi="맑은 고딕"/>
-                <w:sz w:val="19"/>
-                <w:szCs w:val="19"/>
-              </w:rPr>
-              <w:t xml:space="preserve">내용 (시험명·점수 / 프로그램)</w:t>
-            </w:r>
-          </w:p>
-        </w:tc>
-        <w:tc>
-          <w:tcPr>
-            <w:tcW w:type="dxa" w:w="2972"/>
-            <w:tcBorders>
-              <w:top w:val="single" w:color="1B1F24" w:sz="12"/>
-              <w:left w:val="single" w:color="9AA3AD" w:sz="4"/>
-              <w:bottom w:val="single" w:color="9AA3AD" w:sz="4"/>
-              <w:right w:val="single" w:color="9AA3AD" w:sz="4"/>
-            </w:tcBorders>
-            <w:shd w:fill="EEF1F5" w:color="auto" w:val="clear"/>
-            <w:tcMar>
-              <w:top w:type="dxa" w:w="60"/>
-              <w:left w:type="dxa" w:w="100"/>
-              <w:bottom w:type="dxa" w:w="60"/>
-              <w:right w:type="dxa" w:w="100"/>
-            </w:tcMar>
-            <w:vAlign w:val="center"/>
-          </w:tcPr>
-          <w:p>
-            <w:pPr>
-              <w:spacing w:after="0" w:before="0"/>
-              <w:jc w:val="center"/>
-            </w:pPr>
-            <w:r>
-              <w:rPr>
-                <w:rFonts w:ascii="맑은 고딕" w:cs="맑은 고딕" w:eastAsia="맑은 고딕" w:hAnsi="맑은 고딕"/>
-                <w:sz w:val="19"/>
-                <w:szCs w:val="19"/>
-              </w:rPr>
-              <w:t xml:space="preserve">수준</w:t>
-            </w:r>
-          </w:p>
-        </w:tc>
-      </w:tr>
-      <w:tr>
-        <w:trPr>
-          <w:trHeight w:val="420" w:hRule="atLeast"/>
-        </w:trPr>
-        <w:tc>
-          <w:tcPr>
-            <w:tcW w:type="dxa" w:w="2377"/>
-            <w:tcBorders>
-              <w:top w:val="single" w:color="9AA3AD" w:sz="4"/>
-              <w:left w:val="single" w:color="9AA3AD" w:sz="4"/>
-              <w:bottom w:val="single" w:color="9AA3AD" w:sz="4"/>
-              <w:right w:val="single" w:color="9AA3AD" w:sz="4"/>
-            </w:tcBorders>
-            <w:tcMar>
-              <w:top w:type="dxa" w:w="60"/>
-              <w:left w:type="dxa" w:w="100"/>
-              <w:bottom w:type="dxa" w:w="60"/>
-              <w:right w:type="dxa" w:w="100"/>
-            </w:tcMar>
-            <w:vAlign w:val="center"/>
-          </w:tcPr>
-          <w:p>
-            <w:pPr>
-              <w:spacing w:after="0" w:before="0"/>
-              <w:jc w:val="left"/>
-            </w:pPr>
-          </w:p>
-        </w:tc>
-        <w:tc>
-          <w:tcPr>
-            <w:tcW w:type="dxa" w:w="4557"/>
-            <w:tcBorders>
-              <w:top w:val="single" w:color="9AA3AD" w:sz="4"/>
-              <w:left w:val="single" w:color="9AA3AD" w:sz="4"/>
-              <w:bottom w:val="single" w:color="9AA3AD" w:sz="4"/>
-              <w:right w:val="single" w:color="9AA3AD" w:sz="4"/>
-            </w:tcBorders>
-            <w:tcMar>
-              <w:top w:type="dxa" w:w="60"/>
-              <w:left w:type="dxa" w:w="100"/>
-              <w:bottom w:type="dxa" w:w="60"/>
-              <w:right w:type="dxa" w:w="100"/>
-            </w:tcMar>
-            <w:vAlign w:val="center"/>
-          </w:tcPr>
-          <w:p>
-            <w:pPr>
-              <w:spacing w:after="0" w:before="0"/>
-              <w:jc w:val="left"/>
-            </w:pPr>
-          </w:p>
-        </w:tc>
-        <w:tc>
-          <w:tcPr>
-            <w:tcW w:type="dxa" w:w="2972"/>
-            <w:tcBorders>
-              <w:top w:val="single" w:color="9AA3AD" w:sz="4"/>
-              <w:left w:val="single" w:color="9AA3AD" w:sz="4"/>
-              <w:bottom w:val="single" w:color="9AA3AD" w:sz="4"/>
-              <w:right w:val="single" w:color="9AA3AD" w:sz="4"/>
-            </w:tcBorders>
-            <w:tcMar>
-              <w:top w:type="dxa" w:w="60"/>
-              <w:left w:type="dxa" w:w="100"/>
-              <w:bottom w:type="dxa" w:w="60"/>
-              <w:right w:type="dxa" w:w="100"/>
-            </w:tcMar>
-            <w:vAlign w:val="center"/>
-          </w:tcPr>
-          <w:p>
-            <w:pPr>
-              <w:spacing w:after="0" w:before="0"/>
-              <w:jc w:val="left"/>
-            </w:pPr>
-          </w:p>
-        </w:tc>
-      </w:tr>
-      <w:tr>
-        <w:trPr>
-          <w:trHeight w:val="420" w:hRule="atLeast"/>
-        </w:trPr>
-        <w:tc>
-          <w:tcPr>
-            <w:tcW w:type="dxa" w:w="2377"/>
-            <w:tcBorders>
-              <w:top w:val="single" w:color="9AA3AD" w:sz="4"/>
-              <w:left w:val="single" w:color="9AA3AD" w:sz="4"/>
-              <w:bottom w:val="single" w:color="9AA3AD" w:sz="4"/>
-              <w:right w:val="single" w:color="9AA3AD" w:sz="4"/>
-            </w:tcBorders>
-            <w:tcMar>
-              <w:top w:type="dxa" w:w="60"/>
-              <w:left w:type="dxa" w:w="100"/>
-              <w:bottom w:type="dxa" w:w="60"/>
-              <w:right w:type="dxa" w:w="100"/>
-            </w:tcMar>
-            <w:vAlign w:val="center"/>
-          </w:tcPr>
-          <w:p>
-            <w:pPr>
-              <w:spacing w:after="0" w:before="0"/>
-              <w:jc w:val="left"/>
-            </w:pPr>
-          </w:p>
-        </w:tc>
-        <w:tc>
-          <w:tcPr>
-            <w:tcW w:type="dxa" w:w="4557"/>
-            <w:tcBorders>
-              <w:top w:val="single" w:color="9AA3AD" w:sz="4"/>
-              <w:left w:val="single" w:color="9AA3AD" w:sz="4"/>
-              <w:bottom w:val="single" w:color="9AA3AD" w:sz="4"/>
-              <w:right w:val="single" w:color="9AA3AD" w:sz="4"/>
-            </w:tcBorders>
-            <w:tcMar>
-              <w:top w:type="dxa" w:w="60"/>
-              <w:left w:type="dxa" w:w="100"/>
-              <w:bottom w:type="dxa" w:w="60"/>
-              <w:right w:type="dxa" w:w="100"/>
-            </w:tcMar>
-            <w:vAlign w:val="center"/>
-          </w:tcPr>
-          <w:p>
-            <w:pPr>
-              <w:spacing w:after="0" w:before="0"/>
-              <w:jc w:val="left"/>
-            </w:pPr>
-          </w:p>
-        </w:tc>
-        <w:tc>
-          <w:tcPr>
-            <w:tcW w:type="dxa" w:w="2972"/>
-            <w:tcBorders>
-              <w:top w:val="single" w:color="9AA3AD" w:sz="4"/>
-              <w:left w:val="single" w:color="9AA3AD" w:sz="4"/>
-              <w:bottom w:val="single" w:color="9AA3AD" w:sz="4"/>
-              <w:right w:val="single" w:color="9AA3AD" w:sz="4"/>
-            </w:tcBorders>
-            <w:tcMar>
-              <w:top w:type="dxa" w:w="60"/>
-              <w:left w:type="dxa" w:w="100"/>
-              <w:bottom w:type="dxa" w:w="60"/>
-              <w:right w:type="dxa" w:w="100"/>
-            </w:tcMar>
-            <w:vAlign w:val="center"/>
-          </w:tcPr>
-          <w:p>
-            <w:pPr>
-              <w:spacing w:after="0" w:before="0"/>
-              <w:jc w:val="left"/>
-            </w:pPr>
-          </w:p>
-        </w:tc>
-      </w:tr>
-    </w:tbl>
-    <w:p>
-      <w:pPr>
-        <w:keepNext/>
-        <w:pBdr>
-          <w:left w:val="single" w:color="1F3A5F" w:sz="24" w:space="6"/>
-        </w:pBdr>
-        <w:spacing w:after="100" w:before="280"/>
-      </w:pPr>
-      <w:r>
-        <w:rPr>
-          <w:rFonts w:ascii="맑은 고딕" w:cs="맑은 고딕" w:eastAsia="맑은 고딕" w:hAnsi="맑은 고딕"/>
-          <w:b/>
-          <w:bCs/>
-          <w:color w:val="1F3A5F"/>
-          <w:sz w:val="22"/>
-          <w:szCs w:val="22"/>
-        </w:rPr>
-        <w:t xml:space="preserve">병역 · 기타</w:t>
-      </w:r>
-    </w:p>
-    <w:tbl>
-      <w:tblPr>
-        <w:tblW w:type="dxa" w:w="9906"/>
-        <w:tblBorders>
-          <w:top w:val="single" w:color="auto" w:sz="4"/>
-          <w:left w:val="single" w:color="auto" w:sz="4"/>
-          <w:bottom w:val="single" w:color="auto" w:sz="4"/>
-          <w:right w:val="single" w:color="auto" w:sz="4"/>
-          <w:insideH w:val="single" w:color="auto" w:sz="4"/>
-          <w:insideV w:val="single" w:color="auto" w:sz="4"/>
-        </w:tblBorders>
-      </w:tblPr>
-      <w:tblGrid>
-        <w:gridCol w:w="1300"/>
-        <w:gridCol w:w="2002"/>
-        <w:gridCol w:w="1300"/>
-        <w:gridCol w:w="2002"/>
-        <w:gridCol w:w="1300"/>
-        <w:gridCol w:w="2002"/>
-      </w:tblGrid>
-      <w:tr>
-        <w:trPr>
-          <w:trHeight w:val="440" w:hRule="atLeast"/>
-        </w:trPr>
-        <w:tc>
-          <w:tcPr>
-            <w:tcW w:type="dxa" w:w="1300"/>
-            <w:tcBorders>
-              <w:top w:val="single" w:color="1B1F24" w:sz="12"/>
-              <w:left w:val="single" w:color="9AA3AD" w:sz="4"/>
-              <w:bottom w:val="single" w:color="9AA3AD" w:sz="4"/>
-              <w:right w:val="single" w:color="9AA3AD" w:sz="4"/>
-            </w:tcBorders>
-            <w:shd w:fill="EEF1F5" w:color="auto" w:val="clear"/>
-            <w:tcMar>
-              <w:top w:type="dxa" w:w="60"/>
-              <w:left w:type="dxa" w:w="100"/>
-              <w:bottom w:type="dxa" w:w="60"/>
-              <w:right w:type="dxa" w:w="100"/>
-            </w:tcMar>
-            <w:vAlign w:val="center"/>
-          </w:tcPr>
-          <w:p>
-            <w:pPr>
-              <w:spacing w:after="0" w:before="0"/>
-              <w:jc w:val="center"/>
-            </w:pPr>
-            <w:r>
-              <w:rPr>
-                <w:rFonts w:ascii="맑은 고딕" w:cs="맑은 고딕" w:eastAsia="맑은 고딕" w:hAnsi="맑은 고딕"/>
-                <w:sz w:val="19"/>
-                <w:szCs w:val="19"/>
-              </w:rPr>
-              <w:t xml:space="preserve">병역</w:t>
-            </w:r>
-          </w:p>
-        </w:tc>
-        <w:tc>
-          <w:tcPr>
-            <w:tcW w:type="dxa" w:w="2002"/>
-            <w:tcBorders>
-              <w:top w:val="single" w:color="1B1F24" w:sz="12"/>
-              <w:left w:val="single" w:color="9AA3AD" w:sz="4"/>
-              <w:bottom w:val="single" w:color="9AA3AD" w:sz="4"/>
-              <w:right w:val="single" w:color="9AA3AD" w:sz="4"/>
-            </w:tcBorders>
-            <w:tcMar>
-              <w:top w:type="dxa" w:w="60"/>
-              <w:left w:type="dxa" w:w="100"/>
-              <w:bottom w:type="dxa" w:w="60"/>
-              <w:right w:type="dxa" w:w="100"/>
-            </w:tcMar>
-            <w:vAlign w:val="center"/>
-          </w:tcPr>
-          <w:p>
-            <w:pPr>
-              <w:spacing w:after="0" w:before="0"/>
-              <w:jc w:val="left"/>
-            </w:pPr>
-          </w:p>
-        </w:tc>
-        <w:tc>
-          <w:tcPr>
-            <w:tcW w:type="dxa" w:w="1300"/>
-            <w:tcBorders>
-              <w:top w:val="single" w:color="1B1F24" w:sz="12"/>
-              <w:left w:val="single" w:color="9AA3AD" w:sz="4"/>
-              <w:bottom w:val="single" w:color="9AA3AD" w:sz="4"/>
-              <w:right w:val="single" w:color="9AA3AD" w:sz="4"/>
-            </w:tcBorders>
-            <w:shd w:fill="EEF1F5" w:color="auto" w:val="clear"/>
-            <w:tcMar>
-              <w:top w:type="dxa" w:w="60"/>
-              <w:left w:type="dxa" w:w="100"/>
-              <w:bottom w:type="dxa" w:w="60"/>
-              <w:right w:type="dxa" w:w="100"/>
-            </w:tcMar>
-            <w:vAlign w:val="center"/>
-          </w:tcPr>
-          <w:p>
-            <w:pPr>
-              <w:spacing w:after="0" w:before="0"/>
-              <w:jc w:val="center"/>
-            </w:pPr>
-            <w:r>
-              <w:rPr>
-                <w:rFonts w:ascii="맑은 고딕" w:cs="맑은 고딕" w:eastAsia="맑은 고딕" w:hAnsi="맑은 고딕"/>
-                <w:sz w:val="19"/>
-                <w:szCs w:val="19"/>
-              </w:rPr>
-              <w:t xml:space="preserve">보훈</w:t>
-            </w:r>
-          </w:p>
-        </w:tc>
-        <w:tc>
-          <w:tcPr>
-            <w:tcW w:type="dxa" w:w="2002"/>
-            <w:tcBorders>
-              <w:top w:val="single" w:color="1B1F24" w:sz="12"/>
-              <w:left w:val="single" w:color="9AA3AD" w:sz="4"/>
-              <w:bottom w:val="single" w:color="9AA3AD" w:sz="4"/>
-              <w:right w:val="single" w:color="9AA3AD" w:sz="4"/>
-            </w:tcBorders>
-            <w:tcMar>
-              <w:top w:type="dxa" w:w="60"/>
-              <w:left w:type="dxa" w:w="100"/>
-              <w:bottom w:type="dxa" w:w="60"/>
-              <w:right w:type="dxa" w:w="100"/>
-            </w:tcMar>
-            <w:vAlign w:val="center"/>
-          </w:tcPr>
-          <w:p>
-            <w:pPr>
-              <w:spacing w:after="0" w:before="0"/>
-              <w:jc w:val="left"/>
-            </w:pPr>
-          </w:p>
-        </w:tc>
-        <w:tc>
-          <w:tcPr>
-            <w:tcW w:type="dxa" w:w="1300"/>
-            <w:tcBorders>
-              <w:top w:val="single" w:color="1B1F24" w:sz="12"/>
-              <w:left w:val="single" w:color="9AA3AD" w:sz="4"/>
-              <w:bottom w:val="single" w:color="9AA3AD" w:sz="4"/>
-              <w:right w:val="single" w:color="9AA3AD" w:sz="4"/>
-            </w:tcBorders>
-            <w:shd w:fill="EEF1F5" w:color="auto" w:val="clear"/>
-            <w:tcMar>
-              <w:top w:type="dxa" w:w="60"/>
-              <w:left w:type="dxa" w:w="100"/>
-              <w:bottom w:type="dxa" w:w="60"/>
-              <w:right w:type="dxa" w:w="100"/>
-            </w:tcMar>
-            <w:vAlign w:val="center"/>
-          </w:tcPr>
-          <w:p>
-            <w:pPr>
-              <w:spacing w:after="0" w:before="0"/>
-              <w:jc w:val="center"/>
-            </w:pPr>
-            <w:r>
-              <w:rPr>
-                <w:rFonts w:ascii="맑은 고딕" w:cs="맑은 고딕" w:eastAsia="맑은 고딕" w:hAnsi="맑은 고딕"/>
-                <w:sz w:val="19"/>
-                <w:szCs w:val="19"/>
-              </w:rPr>
-              <w:t xml:space="preserve">장애</w:t>
-            </w:r>
-          </w:p>
-        </w:tc>
-        <w:tc>
-          <w:tcPr>
-            <w:tcW w:type="dxa" w:w="2002"/>
-            <w:tcBorders>
-              <w:top w:val="single" w:color="1B1F24" w:sz="12"/>
-              <w:left w:val="single" w:color="9AA3AD" w:sz="4"/>
-              <w:bottom w:val="single" w:color="9AA3AD" w:sz="4"/>
-              <w:right w:val="single" w:color="9AA3AD" w:sz="4"/>
-            </w:tcBorders>
-            <w:tcMar>
-              <w:top w:type="dxa" w:w="60"/>
-              <w:left w:type="dxa" w:w="100"/>
-              <w:bottom w:type="dxa" w:w="60"/>
-              <w:right w:type="dxa" w:w="100"/>
-            </w:tcMar>
-            <w:vAlign w:val="center"/>
-          </w:tcPr>
-          <w:p>
-            <w:pPr>
-              <w:spacing w:after="0" w:before="0"/>
-              <w:jc w:val="left"/>
-            </w:pPr>
-          </w:p>
-        </w:tc>
-      </w:tr>
-    </w:tbl>
-    <w:p>
-      <w:pPr>
-        <w:keepNext/>
-        <w:pBdr>
-          <w:left w:val="single" w:color="1F3A5F" w:sz="24" w:space="6"/>
-        </w:pBdr>
-        <w:spacing w:after="100" w:before="280"/>
-      </w:pPr>
-      <w:r>
-        <w:rPr>
-          <w:rFonts w:ascii="맑은 고딕" w:cs="맑은 고딕" w:eastAsia="맑은 고딕" w:hAnsi="맑은 고딕"/>
-          <w:b/>
-          <w:bCs/>
-          <w:color w:val="1F3A5F"/>
-          <w:sz w:val="22"/>
-          <w:szCs w:val="22"/>
-        </w:rPr>
-        <w:t xml:space="preserve">자기소개</w:t>
-      </w:r>
-    </w:p>
-    <w:tbl>
-      <w:tblPr>
-        <w:tblW w:type="dxa" w:w="9906"/>
-        <w:tblBorders>
-          <w:top w:val="single" w:color="auto" w:sz="4"/>
-          <w:left w:val="single" w:color="auto" w:sz="4"/>
-          <w:bottom w:val="single" w:color="auto" w:sz="4"/>
-          <w:right w:val="single" w:color="auto" w:sz="4"/>
-          <w:insideH w:val="single" w:color="auto" w:sz="4"/>
-          <w:insideV w:val="single" w:color="auto" w:sz="4"/>
-        </w:tblBorders>
-      </w:tblPr>
-      <w:tblGrid>
-        <w:gridCol w:w="9906"/>
-      </w:tblGrid>
-      <w:tr>
-        <w:trPr>
-          <w:trHeight w:val="6800" w:hRule="atLeast"/>
-        </w:trPr>
-        <w:tc>
-          <w:tcPr>
-            <w:tcW w:type="dxa" w:w="9906"/>
-            <w:tcBorders>
-              <w:top w:val="single" w:color="1B1F24" w:sz="12"/>
-              <w:left w:val="single" w:color="9AA3AD" w:sz="4"/>
-              <w:bottom w:val="single" w:color="9AA3AD" w:sz="4"/>
-              <w:right w:val="single" w:color="9AA3AD" w:sz="4"/>
-            </w:tcBorders>
-            <w:tcMar>
-              <w:top w:type="dxa" w:w="60"/>
-              <w:left w:type="dxa" w:w="100"/>
-              <w:bottom w:type="dxa" w:w="60"/>
-              <w:right w:type="dxa" w:w="100"/>
-            </w:tcMar>
-            <w:vAlign w:val="top"/>
-          </w:tcPr>
-          <w:p>
-            <w:pPr>
-              <w:spacing w:after="0" w:before="0"/>
-              <w:jc w:val="left"/>
-            </w:pPr>
-            <w:r>
-              <w:rPr>
-                <w:rFonts w:ascii="맑은 고딕" w:cs="맑은 고딕" w:eastAsia="맑은 고딕" w:hAnsi="맑은 고딕"/>
-                <w:color w:val="A0A7B0"/>
-                <w:sz w:val="19"/>
-                <w:szCs w:val="19"/>
-              </w:rPr>
-              <w:t xml:space="preserve">성장과정, 성격의 장단점, 지원동기, 입사 후 포부 등을 적어주세요.</w:t>
-            </w:r>
-          </w:p>
-        </w:tc>
-      </w:tr>
-    </w:tbl>
-    <w:p>
-      <w:pPr>
-        <w:spacing w:after="120" w:before="400"/>
-        <w:jc w:val="center"/>
-      </w:pPr>
-      <w:r>
-        <w:rPr>
-          <w:rFonts w:ascii="맑은 고딕" w:cs="맑은 고딕" w:eastAsia="맑은 고딕" w:hAnsi="맑은 고딕"/>
-          <w:sz w:val="20"/>
-          <w:szCs w:val="20"/>
-        </w:rPr>
-        <w:t xml:space="preserve">위에 기재한 사항은 사실과 틀림이 없습니다.</w:t>
-      </w:r>
-    </w:p>
-    <w:p>
-      <w:pPr>
-        <w:spacing w:after="120" w:before="0"/>
-        <w:jc w:val="center"/>
-      </w:pPr>
-      <w:r>
-        <w:rPr>
-          <w:rFonts w:ascii="맑은 고딕" w:cs="맑은 고딕" w:eastAsia="맑은 고딕" w:hAnsi="맑은 고딕"/>
-          <w:sz w:val="20"/>
-          <w:szCs w:val="20"/>
-        </w:rPr>
-        <w:t xml:space="preserve">20      년      월      일</w:t>
-      </w:r>
-    </w:p>
-    <w:p>
-      <w:pPr>
-        <w:spacing w:before="120"/>
-        <w:jc w:val="right"/>
-      </w:pPr>
-      <w:r>
-        <w:rPr>
-          <w:rFonts w:ascii="맑은 고딕" w:cs="맑은 고딕" w:eastAsia="맑은 고딕" w:hAnsi="맑은 고딕"/>
-          <w:sz w:val="20"/>
-          <w:szCs w:val="20"/>
-        </w:rPr>
-        <w:t xml:space="preserve">지원자 :                        (인)</w:t>
-      </w:r>
-    </w:p>
     <w:sectPr>
       <w:pgSz w:w="11906" w:h="16838" w:orient="portrait"/>
       <w:pgMar w:top="1000" w:right="1000" w:bottom="900" w:left="1000" w:header="708" w:footer="708" w:gutter="0"/>

</xml_diff>

<commit_message>
Resume (Word): career table shows company, title, period only
Co-Authored-By: Claude Opus 5.5 <noreply@anthropic.com>
Claude-Session: https://claude.ai/code/session_01NeCKgJUUKVxaAf9NpMrAyB
</commit_message>
<xml_diff>
--- a/resume/이력서.docx
+++ b/resume/이력서.docx
@@ -1056,10 +1056,9 @@
         </w:tblBorders>
       </w:tblPr>
       <w:tblGrid>
-        <w:gridCol w:w="2377"/>
-        <w:gridCol w:w="2179"/>
-        <w:gridCol w:w="1585"/>
-        <w:gridCol w:w="3765"/>
+        <w:gridCol w:w="3962"/>
+        <w:gridCol w:w="2477"/>
+        <w:gridCol w:w="3467"/>
       </w:tblGrid>
       <w:tr>
         <w:trPr>
@@ -1067,7 +1066,73 @@
         </w:trPr>
         <w:tc>
           <w:tcPr>
-            <w:tcW w:type="dxa" w:w="2377"/>
+            <w:tcW w:type="dxa" w:w="3962"/>
+            <w:tcBorders>
+              <w:top w:val="single" w:color="1B1F24" w:sz="12"/>
+              <w:left w:val="single" w:color="9AA3AD" w:sz="4"/>
+              <w:bottom w:val="single" w:color="9AA3AD" w:sz="4"/>
+              <w:right w:val="single" w:color="9AA3AD" w:sz="4"/>
+            </w:tcBorders>
+            <w:shd w:fill="EEF1F5" w:color="auto" w:val="clear"/>
+            <w:tcMar>
+              <w:top w:type="dxa" w:w="60"/>
+              <w:left w:type="dxa" w:w="100"/>
+              <w:bottom w:type="dxa" w:w="60"/>
+              <w:right w:type="dxa" w:w="100"/>
+            </w:tcMar>
+            <w:vAlign w:val="center"/>
+          </w:tcPr>
+          <w:p>
+            <w:pPr>
+              <w:spacing w:after="0" w:before="0"/>
+              <w:jc w:val="center"/>
+            </w:pPr>
+            <w:r>
+              <w:rPr>
+                <w:rFonts w:ascii="맑은 고딕" w:cs="맑은 고딕" w:eastAsia="맑은 고딕" w:hAnsi="맑은 고딕"/>
+                <w:sz w:val="19"/>
+                <w:szCs w:val="19"/>
+              </w:rPr>
+              <w:t xml:space="preserve">회사명</w:t>
+            </w:r>
+          </w:p>
+        </w:tc>
+        <w:tc>
+          <w:tcPr>
+            <w:tcW w:type="dxa" w:w="2477"/>
+            <w:tcBorders>
+              <w:top w:val="single" w:color="1B1F24" w:sz="12"/>
+              <w:left w:val="single" w:color="9AA3AD" w:sz="4"/>
+              <w:bottom w:val="single" w:color="9AA3AD" w:sz="4"/>
+              <w:right w:val="single" w:color="9AA3AD" w:sz="4"/>
+            </w:tcBorders>
+            <w:shd w:fill="EEF1F5" w:color="auto" w:val="clear"/>
+            <w:tcMar>
+              <w:top w:type="dxa" w:w="60"/>
+              <w:left w:type="dxa" w:w="100"/>
+              <w:bottom w:type="dxa" w:w="60"/>
+              <w:right w:type="dxa" w:w="100"/>
+            </w:tcMar>
+            <w:vAlign w:val="center"/>
+          </w:tcPr>
+          <w:p>
+            <w:pPr>
+              <w:spacing w:after="0" w:before="0"/>
+              <w:jc w:val="center"/>
+            </w:pPr>
+            <w:r>
+              <w:rPr>
+                <w:rFonts w:ascii="맑은 고딕" w:cs="맑은 고딕" w:eastAsia="맑은 고딕" w:hAnsi="맑은 고딕"/>
+                <w:sz w:val="19"/>
+                <w:szCs w:val="19"/>
+              </w:rPr>
+              <w:t xml:space="preserve">직위</w:t>
+            </w:r>
+          </w:p>
+        </w:tc>
+        <w:tc>
+          <w:tcPr>
+            <w:tcW w:type="dxa" w:w="3467"/>
             <w:tcBorders>
               <w:top w:val="single" w:color="1B1F24" w:sz="12"/>
               <w:left w:val="single" w:color="9AA3AD" w:sz="4"/>
@@ -1098,105 +1163,6 @@
             </w:r>
           </w:p>
         </w:tc>
-        <w:tc>
-          <w:tcPr>
-            <w:tcW w:type="dxa" w:w="2179"/>
-            <w:tcBorders>
-              <w:top w:val="single" w:color="1B1F24" w:sz="12"/>
-              <w:left w:val="single" w:color="9AA3AD" w:sz="4"/>
-              <w:bottom w:val="single" w:color="9AA3AD" w:sz="4"/>
-              <w:right w:val="single" w:color="9AA3AD" w:sz="4"/>
-            </w:tcBorders>
-            <w:shd w:fill="EEF1F5" w:color="auto" w:val="clear"/>
-            <w:tcMar>
-              <w:top w:type="dxa" w:w="60"/>
-              <w:left w:type="dxa" w:w="100"/>
-              <w:bottom w:type="dxa" w:w="60"/>
-              <w:right w:type="dxa" w:w="100"/>
-            </w:tcMar>
-            <w:vAlign w:val="center"/>
-          </w:tcPr>
-          <w:p>
-            <w:pPr>
-              <w:spacing w:after="0" w:before="0"/>
-              <w:jc w:val="center"/>
-            </w:pPr>
-            <w:r>
-              <w:rPr>
-                <w:rFonts w:ascii="맑은 고딕" w:cs="맑은 고딕" w:eastAsia="맑은 고딕" w:hAnsi="맑은 고딕"/>
-                <w:sz w:val="19"/>
-                <w:szCs w:val="19"/>
-              </w:rPr>
-              <w:t xml:space="preserve">회사명</w:t>
-            </w:r>
-          </w:p>
-        </w:tc>
-        <w:tc>
-          <w:tcPr>
-            <w:tcW w:type="dxa" w:w="1585"/>
-            <w:tcBorders>
-              <w:top w:val="single" w:color="1B1F24" w:sz="12"/>
-              <w:left w:val="single" w:color="9AA3AD" w:sz="4"/>
-              <w:bottom w:val="single" w:color="9AA3AD" w:sz="4"/>
-              <w:right w:val="single" w:color="9AA3AD" w:sz="4"/>
-            </w:tcBorders>
-            <w:shd w:fill="EEF1F5" w:color="auto" w:val="clear"/>
-            <w:tcMar>
-              <w:top w:type="dxa" w:w="60"/>
-              <w:left w:type="dxa" w:w="100"/>
-              <w:bottom w:type="dxa" w:w="60"/>
-              <w:right w:type="dxa" w:w="100"/>
-            </w:tcMar>
-            <w:vAlign w:val="center"/>
-          </w:tcPr>
-          <w:p>
-            <w:pPr>
-              <w:spacing w:after="0" w:before="0"/>
-              <w:jc w:val="center"/>
-            </w:pPr>
-            <w:r>
-              <w:rPr>
-                <w:rFonts w:ascii="맑은 고딕" w:cs="맑은 고딕" w:eastAsia="맑은 고딕" w:hAnsi="맑은 고딕"/>
-                <w:sz w:val="19"/>
-                <w:szCs w:val="19"/>
-              </w:rPr>
-              <w:t xml:space="preserve">직위</w:t>
-            </w:r>
-          </w:p>
-        </w:tc>
-        <w:tc>
-          <w:tcPr>
-            <w:tcW w:type="dxa" w:w="3765"/>
-            <w:tcBorders>
-              <w:top w:val="single" w:color="1B1F24" w:sz="12"/>
-              <w:left w:val="single" w:color="9AA3AD" w:sz="4"/>
-              <w:bottom w:val="single" w:color="9AA3AD" w:sz="4"/>
-              <w:right w:val="single" w:color="9AA3AD" w:sz="4"/>
-            </w:tcBorders>
-            <w:shd w:fill="EEF1F5" w:color="auto" w:val="clear"/>
-            <w:tcMar>
-              <w:top w:type="dxa" w:w="60"/>
-              <w:left w:type="dxa" w:w="100"/>
-              <w:bottom w:type="dxa" w:w="60"/>
-              <w:right w:type="dxa" w:w="100"/>
-            </w:tcMar>
-            <w:vAlign w:val="center"/>
-          </w:tcPr>
-          <w:p>
-            <w:pPr>
-              <w:spacing w:after="0" w:before="0"/>
-              <w:jc w:val="center"/>
-            </w:pPr>
-            <w:r>
-              <w:rPr>
-                <w:rFonts w:ascii="맑은 고딕" w:cs="맑은 고딕" w:eastAsia="맑은 고딕" w:hAnsi="맑은 고딕"/>
-                <w:sz w:val="19"/>
-                <w:szCs w:val="19"/>
-              </w:rPr>
-              <w:t xml:space="preserve">담당업무</w:t>
-            </w:r>
-          </w:p>
-        </w:tc>
       </w:tr>
       <w:tr>
         <w:trPr>
@@ -1204,79 +1170,55 @@
         </w:trPr>
         <w:tc>
           <w:tcPr>
-            <w:tcW w:type="dxa" w:w="2377"/>
-            <w:tcBorders>
-              <w:top w:val="single" w:color="9AA3AD" w:sz="4"/>
-              <w:left w:val="single" w:color="9AA3AD" w:sz="4"/>
-              <w:bottom w:val="single" w:color="9AA3AD" w:sz="4"/>
-              <w:right w:val="single" w:color="9AA3AD" w:sz="4"/>
-            </w:tcBorders>
-            <w:tcMar>
-              <w:top w:type="dxa" w:w="60"/>
-              <w:left w:type="dxa" w:w="100"/>
-              <w:bottom w:type="dxa" w:w="60"/>
-              <w:right w:type="dxa" w:w="100"/>
-            </w:tcMar>
-            <w:vAlign w:val="center"/>
-          </w:tcPr>
-          <w:p>
-            <w:pPr>
-              <w:spacing w:after="0" w:before="0"/>
-              <w:jc w:val="left"/>
-            </w:pPr>
-          </w:p>
-        </w:tc>
-        <w:tc>
-          <w:tcPr>
-            <w:tcW w:type="dxa" w:w="2179"/>
-            <w:tcBorders>
-              <w:top w:val="single" w:color="9AA3AD" w:sz="4"/>
-              <w:left w:val="single" w:color="9AA3AD" w:sz="4"/>
-              <w:bottom w:val="single" w:color="9AA3AD" w:sz="4"/>
-              <w:right w:val="single" w:color="9AA3AD" w:sz="4"/>
-            </w:tcBorders>
-            <w:tcMar>
-              <w:top w:type="dxa" w:w="60"/>
-              <w:left w:type="dxa" w:w="100"/>
-              <w:bottom w:type="dxa" w:w="60"/>
-              <w:right w:type="dxa" w:w="100"/>
-            </w:tcMar>
-            <w:vAlign w:val="center"/>
-          </w:tcPr>
-          <w:p>
-            <w:pPr>
-              <w:spacing w:after="0" w:before="0"/>
-              <w:jc w:val="left"/>
-            </w:pPr>
-          </w:p>
-        </w:tc>
-        <w:tc>
-          <w:tcPr>
-            <w:tcW w:type="dxa" w:w="1585"/>
-            <w:tcBorders>
-              <w:top w:val="single" w:color="9AA3AD" w:sz="4"/>
-              <w:left w:val="single" w:color="9AA3AD" w:sz="4"/>
-              <w:bottom w:val="single" w:color="9AA3AD" w:sz="4"/>
-              <w:right w:val="single" w:color="9AA3AD" w:sz="4"/>
-            </w:tcBorders>
-            <w:tcMar>
-              <w:top w:type="dxa" w:w="60"/>
-              <w:left w:type="dxa" w:w="100"/>
-              <w:bottom w:type="dxa" w:w="60"/>
-              <w:right w:type="dxa" w:w="100"/>
-            </w:tcMar>
-            <w:vAlign w:val="center"/>
-          </w:tcPr>
-          <w:p>
-            <w:pPr>
-              <w:spacing w:after="0" w:before="0"/>
-              <w:jc w:val="left"/>
-            </w:pPr>
-          </w:p>
-        </w:tc>
-        <w:tc>
-          <w:tcPr>
-            <w:tcW w:type="dxa" w:w="3765"/>
+            <w:tcW w:type="dxa" w:w="3962"/>
+            <w:tcBorders>
+              <w:top w:val="single" w:color="9AA3AD" w:sz="4"/>
+              <w:left w:val="single" w:color="9AA3AD" w:sz="4"/>
+              <w:bottom w:val="single" w:color="9AA3AD" w:sz="4"/>
+              <w:right w:val="single" w:color="9AA3AD" w:sz="4"/>
+            </w:tcBorders>
+            <w:tcMar>
+              <w:top w:type="dxa" w:w="60"/>
+              <w:left w:type="dxa" w:w="100"/>
+              <w:bottom w:type="dxa" w:w="60"/>
+              <w:right w:type="dxa" w:w="100"/>
+            </w:tcMar>
+            <w:vAlign w:val="center"/>
+          </w:tcPr>
+          <w:p>
+            <w:pPr>
+              <w:spacing w:after="0" w:before="0"/>
+              <w:jc w:val="left"/>
+            </w:pPr>
+          </w:p>
+        </w:tc>
+        <w:tc>
+          <w:tcPr>
+            <w:tcW w:type="dxa" w:w="2477"/>
+            <w:tcBorders>
+              <w:top w:val="single" w:color="9AA3AD" w:sz="4"/>
+              <w:left w:val="single" w:color="9AA3AD" w:sz="4"/>
+              <w:bottom w:val="single" w:color="9AA3AD" w:sz="4"/>
+              <w:right w:val="single" w:color="9AA3AD" w:sz="4"/>
+            </w:tcBorders>
+            <w:tcMar>
+              <w:top w:type="dxa" w:w="60"/>
+              <w:left w:type="dxa" w:w="100"/>
+              <w:bottom w:type="dxa" w:w="60"/>
+              <w:right w:type="dxa" w:w="100"/>
+            </w:tcMar>
+            <w:vAlign w:val="center"/>
+          </w:tcPr>
+          <w:p>
+            <w:pPr>
+              <w:spacing w:after="0" w:before="0"/>
+              <w:jc w:val="left"/>
+            </w:pPr>
+          </w:p>
+        </w:tc>
+        <w:tc>
+          <w:tcPr>
+            <w:tcW w:type="dxa" w:w="3467"/>
             <w:tcBorders>
               <w:top w:val="single" w:color="9AA3AD" w:sz="4"/>
               <w:left w:val="single" w:color="9AA3AD" w:sz="4"/>
@@ -1305,79 +1247,55 @@
         </w:trPr>
         <w:tc>
           <w:tcPr>
-            <w:tcW w:type="dxa" w:w="2377"/>
-            <w:tcBorders>
-              <w:top w:val="single" w:color="9AA3AD" w:sz="4"/>
-              <w:left w:val="single" w:color="9AA3AD" w:sz="4"/>
-              <w:bottom w:val="single" w:color="9AA3AD" w:sz="4"/>
-              <w:right w:val="single" w:color="9AA3AD" w:sz="4"/>
-            </w:tcBorders>
-            <w:tcMar>
-              <w:top w:type="dxa" w:w="60"/>
-              <w:left w:type="dxa" w:w="100"/>
-              <w:bottom w:type="dxa" w:w="60"/>
-              <w:right w:type="dxa" w:w="100"/>
-            </w:tcMar>
-            <w:vAlign w:val="center"/>
-          </w:tcPr>
-          <w:p>
-            <w:pPr>
-              <w:spacing w:after="0" w:before="0"/>
-              <w:jc w:val="left"/>
-            </w:pPr>
-          </w:p>
-        </w:tc>
-        <w:tc>
-          <w:tcPr>
-            <w:tcW w:type="dxa" w:w="2179"/>
-            <w:tcBorders>
-              <w:top w:val="single" w:color="9AA3AD" w:sz="4"/>
-              <w:left w:val="single" w:color="9AA3AD" w:sz="4"/>
-              <w:bottom w:val="single" w:color="9AA3AD" w:sz="4"/>
-              <w:right w:val="single" w:color="9AA3AD" w:sz="4"/>
-            </w:tcBorders>
-            <w:tcMar>
-              <w:top w:type="dxa" w:w="60"/>
-              <w:left w:type="dxa" w:w="100"/>
-              <w:bottom w:type="dxa" w:w="60"/>
-              <w:right w:type="dxa" w:w="100"/>
-            </w:tcMar>
-            <w:vAlign w:val="center"/>
-          </w:tcPr>
-          <w:p>
-            <w:pPr>
-              <w:spacing w:after="0" w:before="0"/>
-              <w:jc w:val="left"/>
-            </w:pPr>
-          </w:p>
-        </w:tc>
-        <w:tc>
-          <w:tcPr>
-            <w:tcW w:type="dxa" w:w="1585"/>
-            <w:tcBorders>
-              <w:top w:val="single" w:color="9AA3AD" w:sz="4"/>
-              <w:left w:val="single" w:color="9AA3AD" w:sz="4"/>
-              <w:bottom w:val="single" w:color="9AA3AD" w:sz="4"/>
-              <w:right w:val="single" w:color="9AA3AD" w:sz="4"/>
-            </w:tcBorders>
-            <w:tcMar>
-              <w:top w:type="dxa" w:w="60"/>
-              <w:left w:type="dxa" w:w="100"/>
-              <w:bottom w:type="dxa" w:w="60"/>
-              <w:right w:type="dxa" w:w="100"/>
-            </w:tcMar>
-            <w:vAlign w:val="center"/>
-          </w:tcPr>
-          <w:p>
-            <w:pPr>
-              <w:spacing w:after="0" w:before="0"/>
-              <w:jc w:val="left"/>
-            </w:pPr>
-          </w:p>
-        </w:tc>
-        <w:tc>
-          <w:tcPr>
-            <w:tcW w:type="dxa" w:w="3765"/>
+            <w:tcW w:type="dxa" w:w="3962"/>
+            <w:tcBorders>
+              <w:top w:val="single" w:color="9AA3AD" w:sz="4"/>
+              <w:left w:val="single" w:color="9AA3AD" w:sz="4"/>
+              <w:bottom w:val="single" w:color="9AA3AD" w:sz="4"/>
+              <w:right w:val="single" w:color="9AA3AD" w:sz="4"/>
+            </w:tcBorders>
+            <w:tcMar>
+              <w:top w:type="dxa" w:w="60"/>
+              <w:left w:type="dxa" w:w="100"/>
+              <w:bottom w:type="dxa" w:w="60"/>
+              <w:right w:type="dxa" w:w="100"/>
+            </w:tcMar>
+            <w:vAlign w:val="center"/>
+          </w:tcPr>
+          <w:p>
+            <w:pPr>
+              <w:spacing w:after="0" w:before="0"/>
+              <w:jc w:val="left"/>
+            </w:pPr>
+          </w:p>
+        </w:tc>
+        <w:tc>
+          <w:tcPr>
+            <w:tcW w:type="dxa" w:w="2477"/>
+            <w:tcBorders>
+              <w:top w:val="single" w:color="9AA3AD" w:sz="4"/>
+              <w:left w:val="single" w:color="9AA3AD" w:sz="4"/>
+              <w:bottom w:val="single" w:color="9AA3AD" w:sz="4"/>
+              <w:right w:val="single" w:color="9AA3AD" w:sz="4"/>
+            </w:tcBorders>
+            <w:tcMar>
+              <w:top w:type="dxa" w:w="60"/>
+              <w:left w:type="dxa" w:w="100"/>
+              <w:bottom w:type="dxa" w:w="60"/>
+              <w:right w:type="dxa" w:w="100"/>
+            </w:tcMar>
+            <w:vAlign w:val="center"/>
+          </w:tcPr>
+          <w:p>
+            <w:pPr>
+              <w:spacing w:after="0" w:before="0"/>
+              <w:jc w:val="left"/>
+            </w:pPr>
+          </w:p>
+        </w:tc>
+        <w:tc>
+          <w:tcPr>
+            <w:tcW w:type="dxa" w:w="3467"/>
             <w:tcBorders>
               <w:top w:val="single" w:color="9AA3AD" w:sz="4"/>
               <w:left w:val="single" w:color="9AA3AD" w:sz="4"/>
@@ -1406,79 +1324,55 @@
         </w:trPr>
         <w:tc>
           <w:tcPr>
-            <w:tcW w:type="dxa" w:w="2377"/>
-            <w:tcBorders>
-              <w:top w:val="single" w:color="9AA3AD" w:sz="4"/>
-              <w:left w:val="single" w:color="9AA3AD" w:sz="4"/>
-              <w:bottom w:val="single" w:color="9AA3AD" w:sz="4"/>
-              <w:right w:val="single" w:color="9AA3AD" w:sz="4"/>
-            </w:tcBorders>
-            <w:tcMar>
-              <w:top w:type="dxa" w:w="60"/>
-              <w:left w:type="dxa" w:w="100"/>
-              <w:bottom w:type="dxa" w:w="60"/>
-              <w:right w:type="dxa" w:w="100"/>
-            </w:tcMar>
-            <w:vAlign w:val="center"/>
-          </w:tcPr>
-          <w:p>
-            <w:pPr>
-              <w:spacing w:after="0" w:before="0"/>
-              <w:jc w:val="left"/>
-            </w:pPr>
-          </w:p>
-        </w:tc>
-        <w:tc>
-          <w:tcPr>
-            <w:tcW w:type="dxa" w:w="2179"/>
-            <w:tcBorders>
-              <w:top w:val="single" w:color="9AA3AD" w:sz="4"/>
-              <w:left w:val="single" w:color="9AA3AD" w:sz="4"/>
-              <w:bottom w:val="single" w:color="9AA3AD" w:sz="4"/>
-              <w:right w:val="single" w:color="9AA3AD" w:sz="4"/>
-            </w:tcBorders>
-            <w:tcMar>
-              <w:top w:type="dxa" w:w="60"/>
-              <w:left w:type="dxa" w:w="100"/>
-              <w:bottom w:type="dxa" w:w="60"/>
-              <w:right w:type="dxa" w:w="100"/>
-            </w:tcMar>
-            <w:vAlign w:val="center"/>
-          </w:tcPr>
-          <w:p>
-            <w:pPr>
-              <w:spacing w:after="0" w:before="0"/>
-              <w:jc w:val="left"/>
-            </w:pPr>
-          </w:p>
-        </w:tc>
-        <w:tc>
-          <w:tcPr>
-            <w:tcW w:type="dxa" w:w="1585"/>
-            <w:tcBorders>
-              <w:top w:val="single" w:color="9AA3AD" w:sz="4"/>
-              <w:left w:val="single" w:color="9AA3AD" w:sz="4"/>
-              <w:bottom w:val="single" w:color="9AA3AD" w:sz="4"/>
-              <w:right w:val="single" w:color="9AA3AD" w:sz="4"/>
-            </w:tcBorders>
-            <w:tcMar>
-              <w:top w:type="dxa" w:w="60"/>
-              <w:left w:type="dxa" w:w="100"/>
-              <w:bottom w:type="dxa" w:w="60"/>
-              <w:right w:type="dxa" w:w="100"/>
-            </w:tcMar>
-            <w:vAlign w:val="center"/>
-          </w:tcPr>
-          <w:p>
-            <w:pPr>
-              <w:spacing w:after="0" w:before="0"/>
-              <w:jc w:val="left"/>
-            </w:pPr>
-          </w:p>
-        </w:tc>
-        <w:tc>
-          <w:tcPr>
-            <w:tcW w:type="dxa" w:w="3765"/>
+            <w:tcW w:type="dxa" w:w="3962"/>
+            <w:tcBorders>
+              <w:top w:val="single" w:color="9AA3AD" w:sz="4"/>
+              <w:left w:val="single" w:color="9AA3AD" w:sz="4"/>
+              <w:bottom w:val="single" w:color="9AA3AD" w:sz="4"/>
+              <w:right w:val="single" w:color="9AA3AD" w:sz="4"/>
+            </w:tcBorders>
+            <w:tcMar>
+              <w:top w:type="dxa" w:w="60"/>
+              <w:left w:type="dxa" w:w="100"/>
+              <w:bottom w:type="dxa" w:w="60"/>
+              <w:right w:type="dxa" w:w="100"/>
+            </w:tcMar>
+            <w:vAlign w:val="center"/>
+          </w:tcPr>
+          <w:p>
+            <w:pPr>
+              <w:spacing w:after="0" w:before="0"/>
+              <w:jc w:val="left"/>
+            </w:pPr>
+          </w:p>
+        </w:tc>
+        <w:tc>
+          <w:tcPr>
+            <w:tcW w:type="dxa" w:w="2477"/>
+            <w:tcBorders>
+              <w:top w:val="single" w:color="9AA3AD" w:sz="4"/>
+              <w:left w:val="single" w:color="9AA3AD" w:sz="4"/>
+              <w:bottom w:val="single" w:color="9AA3AD" w:sz="4"/>
+              <w:right w:val="single" w:color="9AA3AD" w:sz="4"/>
+            </w:tcBorders>
+            <w:tcMar>
+              <w:top w:type="dxa" w:w="60"/>
+              <w:left w:type="dxa" w:w="100"/>
+              <w:bottom w:type="dxa" w:w="60"/>
+              <w:right w:type="dxa" w:w="100"/>
+            </w:tcMar>
+            <w:vAlign w:val="center"/>
+          </w:tcPr>
+          <w:p>
+            <w:pPr>
+              <w:spacing w:after="0" w:before="0"/>
+              <w:jc w:val="left"/>
+            </w:pPr>
+          </w:p>
+        </w:tc>
+        <w:tc>
+          <w:tcPr>
+            <w:tcW w:type="dxa" w:w="3467"/>
             <w:tcBorders>
               <w:top w:val="single" w:color="9AA3AD" w:sz="4"/>
               <w:left w:val="single" w:color="9AA3AD" w:sz="4"/>

</xml_diff>

<commit_message>
Resume (Word): education columns ordered school, major, status, period
Co-Authored-By: Claude Opus 5.5 <noreply@anthropic.com>
Claude-Session: https://claude.ai/code/session_01NeCKgJUUKVxaAf9NpMrAyB
</commit_message>
<xml_diff>
--- a/resume/이력서.docx
+++ b/resume/이력서.docx
@@ -577,15 +577,114 @@
         </w:tblBorders>
       </w:tblPr>
       <w:tblGrid>
+        <w:gridCol w:w="3368"/>
+        <w:gridCol w:w="2377"/>
+        <w:gridCol w:w="1387"/>
         <w:gridCol w:w="2774"/>
-        <w:gridCol w:w="2774"/>
-        <w:gridCol w:w="2972"/>
-        <w:gridCol w:w="1386"/>
       </w:tblGrid>
       <w:tr>
         <w:trPr>
           <w:trHeight w:val="420" w:hRule="atLeast"/>
         </w:trPr>
+        <w:tc>
+          <w:tcPr>
+            <w:tcW w:type="dxa" w:w="3368"/>
+            <w:tcBorders>
+              <w:top w:val="single" w:color="1B1F24" w:sz="12"/>
+              <w:left w:val="single" w:color="9AA3AD" w:sz="4"/>
+              <w:bottom w:val="single" w:color="9AA3AD" w:sz="4"/>
+              <w:right w:val="single" w:color="9AA3AD" w:sz="4"/>
+            </w:tcBorders>
+            <w:shd w:fill="EEF1F5" w:color="auto" w:val="clear"/>
+            <w:tcMar>
+              <w:top w:type="dxa" w:w="60"/>
+              <w:left w:type="dxa" w:w="100"/>
+              <w:bottom w:type="dxa" w:w="60"/>
+              <w:right w:type="dxa" w:w="100"/>
+            </w:tcMar>
+            <w:vAlign w:val="center"/>
+          </w:tcPr>
+          <w:p>
+            <w:pPr>
+              <w:spacing w:after="0" w:before="0"/>
+              <w:jc w:val="center"/>
+            </w:pPr>
+            <w:r>
+              <w:rPr>
+                <w:rFonts w:ascii="맑은 고딕" w:cs="맑은 고딕" w:eastAsia="맑은 고딕" w:hAnsi="맑은 고딕"/>
+                <w:sz w:val="19"/>
+                <w:szCs w:val="19"/>
+              </w:rPr>
+              <w:t xml:space="preserve">학교명</w:t>
+            </w:r>
+          </w:p>
+        </w:tc>
+        <w:tc>
+          <w:tcPr>
+            <w:tcW w:type="dxa" w:w="2377"/>
+            <w:tcBorders>
+              <w:top w:val="single" w:color="1B1F24" w:sz="12"/>
+              <w:left w:val="single" w:color="9AA3AD" w:sz="4"/>
+              <w:bottom w:val="single" w:color="9AA3AD" w:sz="4"/>
+              <w:right w:val="single" w:color="9AA3AD" w:sz="4"/>
+            </w:tcBorders>
+            <w:shd w:fill="EEF1F5" w:color="auto" w:val="clear"/>
+            <w:tcMar>
+              <w:top w:type="dxa" w:w="60"/>
+              <w:left w:type="dxa" w:w="100"/>
+              <w:bottom w:type="dxa" w:w="60"/>
+              <w:right w:type="dxa" w:w="100"/>
+            </w:tcMar>
+            <w:vAlign w:val="center"/>
+          </w:tcPr>
+          <w:p>
+            <w:pPr>
+              <w:spacing w:after="0" w:before="0"/>
+              <w:jc w:val="center"/>
+            </w:pPr>
+            <w:r>
+              <w:rPr>
+                <w:rFonts w:ascii="맑은 고딕" w:cs="맑은 고딕" w:eastAsia="맑은 고딕" w:hAnsi="맑은 고딕"/>
+                <w:sz w:val="19"/>
+                <w:szCs w:val="19"/>
+              </w:rPr>
+              <w:t xml:space="preserve">전공</w:t>
+            </w:r>
+          </w:p>
+        </w:tc>
+        <w:tc>
+          <w:tcPr>
+            <w:tcW w:type="dxa" w:w="1387"/>
+            <w:tcBorders>
+              <w:top w:val="single" w:color="1B1F24" w:sz="12"/>
+              <w:left w:val="single" w:color="9AA3AD" w:sz="4"/>
+              <w:bottom w:val="single" w:color="9AA3AD" w:sz="4"/>
+              <w:right w:val="single" w:color="9AA3AD" w:sz="4"/>
+            </w:tcBorders>
+            <w:shd w:fill="EEF1F5" w:color="auto" w:val="clear"/>
+            <w:tcMar>
+              <w:top w:type="dxa" w:w="60"/>
+              <w:left w:type="dxa" w:w="100"/>
+              <w:bottom w:type="dxa" w:w="60"/>
+              <w:right w:type="dxa" w:w="100"/>
+            </w:tcMar>
+            <w:vAlign w:val="center"/>
+          </w:tcPr>
+          <w:p>
+            <w:pPr>
+              <w:spacing w:after="0" w:before="0"/>
+              <w:jc w:val="center"/>
+            </w:pPr>
+            <w:r>
+              <w:rPr>
+                <w:rFonts w:ascii="맑은 고딕" w:cs="맑은 고딕" w:eastAsia="맑은 고딕" w:hAnsi="맑은 고딕"/>
+                <w:sz w:val="19"/>
+                <w:szCs w:val="19"/>
+              </w:rPr>
+              <w:t xml:space="preserve">구분</w:t>
+            </w:r>
+          </w:p>
+        </w:tc>
         <w:tc>
           <w:tcPr>
             <w:tcW w:type="dxa" w:w="2774"/>
@@ -619,105 +718,6 @@
             </w:r>
           </w:p>
         </w:tc>
-        <w:tc>
-          <w:tcPr>
-            <w:tcW w:type="dxa" w:w="2774"/>
-            <w:tcBorders>
-              <w:top w:val="single" w:color="1B1F24" w:sz="12"/>
-              <w:left w:val="single" w:color="9AA3AD" w:sz="4"/>
-              <w:bottom w:val="single" w:color="9AA3AD" w:sz="4"/>
-              <w:right w:val="single" w:color="9AA3AD" w:sz="4"/>
-            </w:tcBorders>
-            <w:shd w:fill="EEF1F5" w:color="auto" w:val="clear"/>
-            <w:tcMar>
-              <w:top w:type="dxa" w:w="60"/>
-              <w:left w:type="dxa" w:w="100"/>
-              <w:bottom w:type="dxa" w:w="60"/>
-              <w:right w:type="dxa" w:w="100"/>
-            </w:tcMar>
-            <w:vAlign w:val="center"/>
-          </w:tcPr>
-          <w:p>
-            <w:pPr>
-              <w:spacing w:after="0" w:before="0"/>
-              <w:jc w:val="center"/>
-            </w:pPr>
-            <w:r>
-              <w:rPr>
-                <w:rFonts w:ascii="맑은 고딕" w:cs="맑은 고딕" w:eastAsia="맑은 고딕" w:hAnsi="맑은 고딕"/>
-                <w:sz w:val="19"/>
-                <w:szCs w:val="19"/>
-              </w:rPr>
-              <w:t xml:space="preserve">학교명</w:t>
-            </w:r>
-          </w:p>
-        </w:tc>
-        <w:tc>
-          <w:tcPr>
-            <w:tcW w:type="dxa" w:w="2972"/>
-            <w:tcBorders>
-              <w:top w:val="single" w:color="1B1F24" w:sz="12"/>
-              <w:left w:val="single" w:color="9AA3AD" w:sz="4"/>
-              <w:bottom w:val="single" w:color="9AA3AD" w:sz="4"/>
-              <w:right w:val="single" w:color="9AA3AD" w:sz="4"/>
-            </w:tcBorders>
-            <w:shd w:fill="EEF1F5" w:color="auto" w:val="clear"/>
-            <w:tcMar>
-              <w:top w:type="dxa" w:w="60"/>
-              <w:left w:type="dxa" w:w="100"/>
-              <w:bottom w:type="dxa" w:w="60"/>
-              <w:right w:type="dxa" w:w="100"/>
-            </w:tcMar>
-            <w:vAlign w:val="center"/>
-          </w:tcPr>
-          <w:p>
-            <w:pPr>
-              <w:spacing w:after="0" w:before="0"/>
-              <w:jc w:val="center"/>
-            </w:pPr>
-            <w:r>
-              <w:rPr>
-                <w:rFonts w:ascii="맑은 고딕" w:cs="맑은 고딕" w:eastAsia="맑은 고딕" w:hAnsi="맑은 고딕"/>
-                <w:sz w:val="19"/>
-                <w:szCs w:val="19"/>
-              </w:rPr>
-              <w:t xml:space="preserve">전공</w:t>
-            </w:r>
-          </w:p>
-        </w:tc>
-        <w:tc>
-          <w:tcPr>
-            <w:tcW w:type="dxa" w:w="1386"/>
-            <w:tcBorders>
-              <w:top w:val="single" w:color="1B1F24" w:sz="12"/>
-              <w:left w:val="single" w:color="9AA3AD" w:sz="4"/>
-              <w:bottom w:val="single" w:color="9AA3AD" w:sz="4"/>
-              <w:right w:val="single" w:color="9AA3AD" w:sz="4"/>
-            </w:tcBorders>
-            <w:shd w:fill="EEF1F5" w:color="auto" w:val="clear"/>
-            <w:tcMar>
-              <w:top w:type="dxa" w:w="60"/>
-              <w:left w:type="dxa" w:w="100"/>
-              <w:bottom w:type="dxa" w:w="60"/>
-              <w:right w:type="dxa" w:w="100"/>
-            </w:tcMar>
-            <w:vAlign w:val="center"/>
-          </w:tcPr>
-          <w:p>
-            <w:pPr>
-              <w:spacing w:after="0" w:before="0"/>
-              <w:jc w:val="center"/>
-            </w:pPr>
-            <w:r>
-              <w:rPr>
-                <w:rFonts w:ascii="맑은 고딕" w:cs="맑은 고딕" w:eastAsia="맑은 고딕" w:hAnsi="맑은 고딕"/>
-                <w:sz w:val="19"/>
-                <w:szCs w:val="19"/>
-              </w:rPr>
-              <w:t xml:space="preserve">구분</w:t>
-            </w:r>
-          </w:p>
-        </w:tc>
       </w:tr>
       <w:tr>
         <w:trPr>
@@ -725,79 +725,79 @@
         </w:trPr>
         <w:tc>
           <w:tcPr>
+            <w:tcW w:type="dxa" w:w="3368"/>
+            <w:tcBorders>
+              <w:top w:val="single" w:color="9AA3AD" w:sz="4"/>
+              <w:left w:val="single" w:color="9AA3AD" w:sz="4"/>
+              <w:bottom w:val="single" w:color="9AA3AD" w:sz="4"/>
+              <w:right w:val="single" w:color="9AA3AD" w:sz="4"/>
+            </w:tcBorders>
+            <w:tcMar>
+              <w:top w:type="dxa" w:w="60"/>
+              <w:left w:type="dxa" w:w="100"/>
+              <w:bottom w:type="dxa" w:w="60"/>
+              <w:right w:type="dxa" w:w="100"/>
+            </w:tcMar>
+            <w:vAlign w:val="center"/>
+          </w:tcPr>
+          <w:p>
+            <w:pPr>
+              <w:spacing w:after="0" w:before="0"/>
+              <w:jc w:val="left"/>
+            </w:pPr>
+          </w:p>
+        </w:tc>
+        <w:tc>
+          <w:tcPr>
+            <w:tcW w:type="dxa" w:w="2377"/>
+            <w:tcBorders>
+              <w:top w:val="single" w:color="9AA3AD" w:sz="4"/>
+              <w:left w:val="single" w:color="9AA3AD" w:sz="4"/>
+              <w:bottom w:val="single" w:color="9AA3AD" w:sz="4"/>
+              <w:right w:val="single" w:color="9AA3AD" w:sz="4"/>
+            </w:tcBorders>
+            <w:tcMar>
+              <w:top w:type="dxa" w:w="60"/>
+              <w:left w:type="dxa" w:w="100"/>
+              <w:bottom w:type="dxa" w:w="60"/>
+              <w:right w:type="dxa" w:w="100"/>
+            </w:tcMar>
+            <w:vAlign w:val="center"/>
+          </w:tcPr>
+          <w:p>
+            <w:pPr>
+              <w:spacing w:after="0" w:before="0"/>
+              <w:jc w:val="left"/>
+            </w:pPr>
+          </w:p>
+        </w:tc>
+        <w:tc>
+          <w:tcPr>
+            <w:tcW w:type="dxa" w:w="1387"/>
+            <w:tcBorders>
+              <w:top w:val="single" w:color="9AA3AD" w:sz="4"/>
+              <w:left w:val="single" w:color="9AA3AD" w:sz="4"/>
+              <w:bottom w:val="single" w:color="9AA3AD" w:sz="4"/>
+              <w:right w:val="single" w:color="9AA3AD" w:sz="4"/>
+            </w:tcBorders>
+            <w:tcMar>
+              <w:top w:type="dxa" w:w="60"/>
+              <w:left w:type="dxa" w:w="100"/>
+              <w:bottom w:type="dxa" w:w="60"/>
+              <w:right w:type="dxa" w:w="100"/>
+            </w:tcMar>
+            <w:vAlign w:val="center"/>
+          </w:tcPr>
+          <w:p>
+            <w:pPr>
+              <w:spacing w:after="0" w:before="0"/>
+              <w:jc w:val="left"/>
+            </w:pPr>
+          </w:p>
+        </w:tc>
+        <w:tc>
+          <w:tcPr>
             <w:tcW w:type="dxa" w:w="2774"/>
-            <w:tcBorders>
-              <w:top w:val="single" w:color="9AA3AD" w:sz="4"/>
-              <w:left w:val="single" w:color="9AA3AD" w:sz="4"/>
-              <w:bottom w:val="single" w:color="9AA3AD" w:sz="4"/>
-              <w:right w:val="single" w:color="9AA3AD" w:sz="4"/>
-            </w:tcBorders>
-            <w:tcMar>
-              <w:top w:type="dxa" w:w="60"/>
-              <w:left w:type="dxa" w:w="100"/>
-              <w:bottom w:type="dxa" w:w="60"/>
-              <w:right w:type="dxa" w:w="100"/>
-            </w:tcMar>
-            <w:vAlign w:val="center"/>
-          </w:tcPr>
-          <w:p>
-            <w:pPr>
-              <w:spacing w:after="0" w:before="0"/>
-              <w:jc w:val="left"/>
-            </w:pPr>
-          </w:p>
-        </w:tc>
-        <w:tc>
-          <w:tcPr>
-            <w:tcW w:type="dxa" w:w="2774"/>
-            <w:tcBorders>
-              <w:top w:val="single" w:color="9AA3AD" w:sz="4"/>
-              <w:left w:val="single" w:color="9AA3AD" w:sz="4"/>
-              <w:bottom w:val="single" w:color="9AA3AD" w:sz="4"/>
-              <w:right w:val="single" w:color="9AA3AD" w:sz="4"/>
-            </w:tcBorders>
-            <w:tcMar>
-              <w:top w:type="dxa" w:w="60"/>
-              <w:left w:type="dxa" w:w="100"/>
-              <w:bottom w:type="dxa" w:w="60"/>
-              <w:right w:type="dxa" w:w="100"/>
-            </w:tcMar>
-            <w:vAlign w:val="center"/>
-          </w:tcPr>
-          <w:p>
-            <w:pPr>
-              <w:spacing w:after="0" w:before="0"/>
-              <w:jc w:val="left"/>
-            </w:pPr>
-          </w:p>
-        </w:tc>
-        <w:tc>
-          <w:tcPr>
-            <w:tcW w:type="dxa" w:w="2972"/>
-            <w:tcBorders>
-              <w:top w:val="single" w:color="9AA3AD" w:sz="4"/>
-              <w:left w:val="single" w:color="9AA3AD" w:sz="4"/>
-              <w:bottom w:val="single" w:color="9AA3AD" w:sz="4"/>
-              <w:right w:val="single" w:color="9AA3AD" w:sz="4"/>
-            </w:tcBorders>
-            <w:tcMar>
-              <w:top w:type="dxa" w:w="60"/>
-              <w:left w:type="dxa" w:w="100"/>
-              <w:bottom w:type="dxa" w:w="60"/>
-              <w:right w:type="dxa" w:w="100"/>
-            </w:tcMar>
-            <w:vAlign w:val="center"/>
-          </w:tcPr>
-          <w:p>
-            <w:pPr>
-              <w:spacing w:after="0" w:before="0"/>
-              <w:jc w:val="left"/>
-            </w:pPr>
-          </w:p>
-        </w:tc>
-        <w:tc>
-          <w:tcPr>
-            <w:tcW w:type="dxa" w:w="1386"/>
             <w:tcBorders>
               <w:top w:val="single" w:color="9AA3AD" w:sz="4"/>
               <w:left w:val="single" w:color="9AA3AD" w:sz="4"/>
@@ -826,79 +826,79 @@
         </w:trPr>
         <w:tc>
           <w:tcPr>
+            <w:tcW w:type="dxa" w:w="3368"/>
+            <w:tcBorders>
+              <w:top w:val="single" w:color="9AA3AD" w:sz="4"/>
+              <w:left w:val="single" w:color="9AA3AD" w:sz="4"/>
+              <w:bottom w:val="single" w:color="9AA3AD" w:sz="4"/>
+              <w:right w:val="single" w:color="9AA3AD" w:sz="4"/>
+            </w:tcBorders>
+            <w:tcMar>
+              <w:top w:type="dxa" w:w="60"/>
+              <w:left w:type="dxa" w:w="100"/>
+              <w:bottom w:type="dxa" w:w="60"/>
+              <w:right w:type="dxa" w:w="100"/>
+            </w:tcMar>
+            <w:vAlign w:val="center"/>
+          </w:tcPr>
+          <w:p>
+            <w:pPr>
+              <w:spacing w:after="0" w:before="0"/>
+              <w:jc w:val="left"/>
+            </w:pPr>
+          </w:p>
+        </w:tc>
+        <w:tc>
+          <w:tcPr>
+            <w:tcW w:type="dxa" w:w="2377"/>
+            <w:tcBorders>
+              <w:top w:val="single" w:color="9AA3AD" w:sz="4"/>
+              <w:left w:val="single" w:color="9AA3AD" w:sz="4"/>
+              <w:bottom w:val="single" w:color="9AA3AD" w:sz="4"/>
+              <w:right w:val="single" w:color="9AA3AD" w:sz="4"/>
+            </w:tcBorders>
+            <w:tcMar>
+              <w:top w:type="dxa" w:w="60"/>
+              <w:left w:type="dxa" w:w="100"/>
+              <w:bottom w:type="dxa" w:w="60"/>
+              <w:right w:type="dxa" w:w="100"/>
+            </w:tcMar>
+            <w:vAlign w:val="center"/>
+          </w:tcPr>
+          <w:p>
+            <w:pPr>
+              <w:spacing w:after="0" w:before="0"/>
+              <w:jc w:val="left"/>
+            </w:pPr>
+          </w:p>
+        </w:tc>
+        <w:tc>
+          <w:tcPr>
+            <w:tcW w:type="dxa" w:w="1387"/>
+            <w:tcBorders>
+              <w:top w:val="single" w:color="9AA3AD" w:sz="4"/>
+              <w:left w:val="single" w:color="9AA3AD" w:sz="4"/>
+              <w:bottom w:val="single" w:color="9AA3AD" w:sz="4"/>
+              <w:right w:val="single" w:color="9AA3AD" w:sz="4"/>
+            </w:tcBorders>
+            <w:tcMar>
+              <w:top w:type="dxa" w:w="60"/>
+              <w:left w:type="dxa" w:w="100"/>
+              <w:bottom w:type="dxa" w:w="60"/>
+              <w:right w:type="dxa" w:w="100"/>
+            </w:tcMar>
+            <w:vAlign w:val="center"/>
+          </w:tcPr>
+          <w:p>
+            <w:pPr>
+              <w:spacing w:after="0" w:before="0"/>
+              <w:jc w:val="left"/>
+            </w:pPr>
+          </w:p>
+        </w:tc>
+        <w:tc>
+          <w:tcPr>
             <w:tcW w:type="dxa" w:w="2774"/>
-            <w:tcBorders>
-              <w:top w:val="single" w:color="9AA3AD" w:sz="4"/>
-              <w:left w:val="single" w:color="9AA3AD" w:sz="4"/>
-              <w:bottom w:val="single" w:color="9AA3AD" w:sz="4"/>
-              <w:right w:val="single" w:color="9AA3AD" w:sz="4"/>
-            </w:tcBorders>
-            <w:tcMar>
-              <w:top w:type="dxa" w:w="60"/>
-              <w:left w:type="dxa" w:w="100"/>
-              <w:bottom w:type="dxa" w:w="60"/>
-              <w:right w:type="dxa" w:w="100"/>
-            </w:tcMar>
-            <w:vAlign w:val="center"/>
-          </w:tcPr>
-          <w:p>
-            <w:pPr>
-              <w:spacing w:after="0" w:before="0"/>
-              <w:jc w:val="left"/>
-            </w:pPr>
-          </w:p>
-        </w:tc>
-        <w:tc>
-          <w:tcPr>
-            <w:tcW w:type="dxa" w:w="2774"/>
-            <w:tcBorders>
-              <w:top w:val="single" w:color="9AA3AD" w:sz="4"/>
-              <w:left w:val="single" w:color="9AA3AD" w:sz="4"/>
-              <w:bottom w:val="single" w:color="9AA3AD" w:sz="4"/>
-              <w:right w:val="single" w:color="9AA3AD" w:sz="4"/>
-            </w:tcBorders>
-            <w:tcMar>
-              <w:top w:type="dxa" w:w="60"/>
-              <w:left w:type="dxa" w:w="100"/>
-              <w:bottom w:type="dxa" w:w="60"/>
-              <w:right w:type="dxa" w:w="100"/>
-            </w:tcMar>
-            <w:vAlign w:val="center"/>
-          </w:tcPr>
-          <w:p>
-            <w:pPr>
-              <w:spacing w:after="0" w:before="0"/>
-              <w:jc w:val="left"/>
-            </w:pPr>
-          </w:p>
-        </w:tc>
-        <w:tc>
-          <w:tcPr>
-            <w:tcW w:type="dxa" w:w="2972"/>
-            <w:tcBorders>
-              <w:top w:val="single" w:color="9AA3AD" w:sz="4"/>
-              <w:left w:val="single" w:color="9AA3AD" w:sz="4"/>
-              <w:bottom w:val="single" w:color="9AA3AD" w:sz="4"/>
-              <w:right w:val="single" w:color="9AA3AD" w:sz="4"/>
-            </w:tcBorders>
-            <w:tcMar>
-              <w:top w:type="dxa" w:w="60"/>
-              <w:left w:type="dxa" w:w="100"/>
-              <w:bottom w:type="dxa" w:w="60"/>
-              <w:right w:type="dxa" w:w="100"/>
-            </w:tcMar>
-            <w:vAlign w:val="center"/>
-          </w:tcPr>
-          <w:p>
-            <w:pPr>
-              <w:spacing w:after="0" w:before="0"/>
-              <w:jc w:val="left"/>
-            </w:pPr>
-          </w:p>
-        </w:tc>
-        <w:tc>
-          <w:tcPr>
-            <w:tcW w:type="dxa" w:w="1386"/>
             <w:tcBorders>
               <w:top w:val="single" w:color="9AA3AD" w:sz="4"/>
               <w:left w:val="single" w:color="9AA3AD" w:sz="4"/>
@@ -927,79 +927,79 @@
         </w:trPr>
         <w:tc>
           <w:tcPr>
+            <w:tcW w:type="dxa" w:w="3368"/>
+            <w:tcBorders>
+              <w:top w:val="single" w:color="9AA3AD" w:sz="4"/>
+              <w:left w:val="single" w:color="9AA3AD" w:sz="4"/>
+              <w:bottom w:val="single" w:color="9AA3AD" w:sz="4"/>
+              <w:right w:val="single" w:color="9AA3AD" w:sz="4"/>
+            </w:tcBorders>
+            <w:tcMar>
+              <w:top w:type="dxa" w:w="60"/>
+              <w:left w:type="dxa" w:w="100"/>
+              <w:bottom w:type="dxa" w:w="60"/>
+              <w:right w:type="dxa" w:w="100"/>
+            </w:tcMar>
+            <w:vAlign w:val="center"/>
+          </w:tcPr>
+          <w:p>
+            <w:pPr>
+              <w:spacing w:after="0" w:before="0"/>
+              <w:jc w:val="left"/>
+            </w:pPr>
+          </w:p>
+        </w:tc>
+        <w:tc>
+          <w:tcPr>
+            <w:tcW w:type="dxa" w:w="2377"/>
+            <w:tcBorders>
+              <w:top w:val="single" w:color="9AA3AD" w:sz="4"/>
+              <w:left w:val="single" w:color="9AA3AD" w:sz="4"/>
+              <w:bottom w:val="single" w:color="9AA3AD" w:sz="4"/>
+              <w:right w:val="single" w:color="9AA3AD" w:sz="4"/>
+            </w:tcBorders>
+            <w:tcMar>
+              <w:top w:type="dxa" w:w="60"/>
+              <w:left w:type="dxa" w:w="100"/>
+              <w:bottom w:type="dxa" w:w="60"/>
+              <w:right w:type="dxa" w:w="100"/>
+            </w:tcMar>
+            <w:vAlign w:val="center"/>
+          </w:tcPr>
+          <w:p>
+            <w:pPr>
+              <w:spacing w:after="0" w:before="0"/>
+              <w:jc w:val="left"/>
+            </w:pPr>
+          </w:p>
+        </w:tc>
+        <w:tc>
+          <w:tcPr>
+            <w:tcW w:type="dxa" w:w="1387"/>
+            <w:tcBorders>
+              <w:top w:val="single" w:color="9AA3AD" w:sz="4"/>
+              <w:left w:val="single" w:color="9AA3AD" w:sz="4"/>
+              <w:bottom w:val="single" w:color="9AA3AD" w:sz="4"/>
+              <w:right w:val="single" w:color="9AA3AD" w:sz="4"/>
+            </w:tcBorders>
+            <w:tcMar>
+              <w:top w:type="dxa" w:w="60"/>
+              <w:left w:type="dxa" w:w="100"/>
+              <w:bottom w:type="dxa" w:w="60"/>
+              <w:right w:type="dxa" w:w="100"/>
+            </w:tcMar>
+            <w:vAlign w:val="center"/>
+          </w:tcPr>
+          <w:p>
+            <w:pPr>
+              <w:spacing w:after="0" w:before="0"/>
+              <w:jc w:val="left"/>
+            </w:pPr>
+          </w:p>
+        </w:tc>
+        <w:tc>
+          <w:tcPr>
             <w:tcW w:type="dxa" w:w="2774"/>
-            <w:tcBorders>
-              <w:top w:val="single" w:color="9AA3AD" w:sz="4"/>
-              <w:left w:val="single" w:color="9AA3AD" w:sz="4"/>
-              <w:bottom w:val="single" w:color="9AA3AD" w:sz="4"/>
-              <w:right w:val="single" w:color="9AA3AD" w:sz="4"/>
-            </w:tcBorders>
-            <w:tcMar>
-              <w:top w:type="dxa" w:w="60"/>
-              <w:left w:type="dxa" w:w="100"/>
-              <w:bottom w:type="dxa" w:w="60"/>
-              <w:right w:type="dxa" w:w="100"/>
-            </w:tcMar>
-            <w:vAlign w:val="center"/>
-          </w:tcPr>
-          <w:p>
-            <w:pPr>
-              <w:spacing w:after="0" w:before="0"/>
-              <w:jc w:val="left"/>
-            </w:pPr>
-          </w:p>
-        </w:tc>
-        <w:tc>
-          <w:tcPr>
-            <w:tcW w:type="dxa" w:w="2774"/>
-            <w:tcBorders>
-              <w:top w:val="single" w:color="9AA3AD" w:sz="4"/>
-              <w:left w:val="single" w:color="9AA3AD" w:sz="4"/>
-              <w:bottom w:val="single" w:color="9AA3AD" w:sz="4"/>
-              <w:right w:val="single" w:color="9AA3AD" w:sz="4"/>
-            </w:tcBorders>
-            <w:tcMar>
-              <w:top w:type="dxa" w:w="60"/>
-              <w:left w:type="dxa" w:w="100"/>
-              <w:bottom w:type="dxa" w:w="60"/>
-              <w:right w:type="dxa" w:w="100"/>
-            </w:tcMar>
-            <w:vAlign w:val="center"/>
-          </w:tcPr>
-          <w:p>
-            <w:pPr>
-              <w:spacing w:after="0" w:before="0"/>
-              <w:jc w:val="left"/>
-            </w:pPr>
-          </w:p>
-        </w:tc>
-        <w:tc>
-          <w:tcPr>
-            <w:tcW w:type="dxa" w:w="2972"/>
-            <w:tcBorders>
-              <w:top w:val="single" w:color="9AA3AD" w:sz="4"/>
-              <w:left w:val="single" w:color="9AA3AD" w:sz="4"/>
-              <w:bottom w:val="single" w:color="9AA3AD" w:sz="4"/>
-              <w:right w:val="single" w:color="9AA3AD" w:sz="4"/>
-            </w:tcBorders>
-            <w:tcMar>
-              <w:top w:type="dxa" w:w="60"/>
-              <w:left w:type="dxa" w:w="100"/>
-              <w:bottom w:type="dxa" w:w="60"/>
-              <w:right w:type="dxa" w:w="100"/>
-            </w:tcMar>
-            <w:vAlign w:val="center"/>
-          </w:tcPr>
-          <w:p>
-            <w:pPr>
-              <w:spacing w:after="0" w:before="0"/>
-              <w:jc w:val="left"/>
-            </w:pPr>
-          </w:p>
-        </w:tc>
-        <w:tc>
-          <w:tcPr>
-            <w:tcW w:type="dxa" w:w="1386"/>
             <w:tcBorders>
               <w:top w:val="single" w:color="9AA3AD" w:sz="4"/>
               <w:left w:val="single" w:color="9AA3AD" w:sz="4"/>

</xml_diff>